<commit_message>
feat: add support for reverting escaped LaTeX commands and update tests
</commit_message>
<xml_diff>
--- a/test/paperaj.docx
+++ b/test/paperaj.docx
@@ -4,7 +4,15 @@
   <w:body>
     <w:p>
       <w:r>
-        <w:t>&lt;paperaj-title&gt;</w:t>
+        <w:t>&lt;</w:t>
+      </w:r>
+      <w:proofErr w:type="spellStart"/>
+      <w:r>
+        <w:t>paperaj</w:t>
+      </w:r>
+      <w:proofErr w:type="spellEnd"/>
+      <w:r>
+        <w:t>-title&gt;</w:t>
       </w:r>
     </w:p>
     <w:p>
@@ -18,12 +26,28 @@
     </w:p>
     <w:p>
       <w:r>
-        <w:t>&lt;/paperaj-title&gt;</w:t>
-      </w:r>
-    </w:p>
-    <w:p>
-      <w:r>
-        <w:t>&lt;paperaj-authors&gt;</w:t>
+        <w:t>&lt;/</w:t>
+      </w:r>
+      <w:proofErr w:type="spellStart"/>
+      <w:r>
+        <w:t>paperaj</w:t>
+      </w:r>
+      <w:proofErr w:type="spellEnd"/>
+      <w:r>
+        <w:t>-title&gt;</w:t>
+      </w:r>
+    </w:p>
+    <w:p>
+      <w:r>
+        <w:t>&lt;</w:t>
+      </w:r>
+      <w:proofErr w:type="spellStart"/>
+      <w:r>
+        <w:t>paperaj</w:t>
+      </w:r>
+      <w:proofErr w:type="spellEnd"/>
+      <w:r>
+        <w:t>-authors&gt;</w:t>
       </w:r>
     </w:p>
     <w:p>
@@ -60,7 +84,15 @@
     </w:p>
     <w:p>
       <w:r>
-        <w:t>&lt;/paperaj-authors&gt;</w:t>
+        <w:t>&lt;/</w:t>
+      </w:r>
+      <w:proofErr w:type="spellStart"/>
+      <w:r>
+        <w:t>paperaj</w:t>
+      </w:r>
+      <w:proofErr w:type="spellEnd"/>
+      <w:r>
+        <w:t>-authors&gt;</w:t>
       </w:r>
     </w:p>
     <w:p>
@@ -71,7 +103,15 @@
     </w:p>
     <w:p>
       <w:r>
-        <w:t>&lt;paperaj-abstract&gt;</w:t>
+        <w:t>&lt;</w:t>
+      </w:r>
+      <w:proofErr w:type="spellStart"/>
+      <w:r>
+        <w:t>paperaj</w:t>
+      </w:r>
+      <w:proofErr w:type="spellEnd"/>
+      <w:r>
+        <w:t>-abstract&gt;</w:t>
       </w:r>
     </w:p>
     <w:p>
@@ -86,16 +126,46 @@
       <w:r>
         <w:t>Objective: To illustrate a reproducible workflow that integrates qualitative and quantitative data using computational triangulation. Methods: We developed a synthetic dataset combining survey responses (n=240) and interview excerpts (n=30). We applied topic modeling, sentiment analysis, and thematic coding, then triangulated findings via concordance indices. Results: Topic prevalence correlated with quantitative scale scores (r=0.42), and cross-modal agreement reached 78% across three thematic domains. Conclusions: The workflow enhances validity in mixed-methods studies and can be operationalized with open-source tools. The protocol and templates are shared for reuse.</w:t>
       </w:r>
-    </w:p>
-    <w:p>
-      <w:r>
-        <w:t>&lt;/paperaj-abstract&gt;</w:t>
+      <w:r>
+        <w:t xml:space="preserve"> It is available here: </w:t>
+      </w:r>
+      <w:r>
+        <w:t>\</w:t>
+      </w:r>
+      <w:proofErr w:type="spellStart"/>
+      <w:r>
+        <w:t>href</w:t>
+      </w:r>
+      <w:proofErr w:type="spellEnd"/>
+      <w:r>
+        <w:t>{http://www.overleaf.com}{Something Linky}</w:t>
+      </w:r>
+    </w:p>
+    <w:p>
+      <w:r>
+        <w:t>&lt;/</w:t>
+      </w:r>
+      <w:proofErr w:type="spellStart"/>
+      <w:r>
+        <w:t>paperaj</w:t>
+      </w:r>
+      <w:proofErr w:type="spellEnd"/>
+      <w:r>
+        <w:t>-abstract&gt;</w:t>
       </w:r>
     </w:p>
     <w:p/>
     <w:p>
       <w:r>
-        <w:t>&lt;paperaj-keywords&gt;</w:t>
+        <w:t>&lt;</w:t>
+      </w:r>
+      <w:proofErr w:type="spellStart"/>
+      <w:r>
+        <w:t>paperaj</w:t>
+      </w:r>
+      <w:proofErr w:type="spellEnd"/>
+      <w:r>
+        <w:t>-keywords&gt;</w:t>
       </w:r>
     </w:p>
     <w:p>
@@ -114,13 +184,29 @@
     <w:p>
       <w:r>
         <w:lastRenderedPageBreak/>
-        <w:t>&lt;/paperaj-keywords&gt;</w:t>
+        <w:t>&lt;/</w:t>
+      </w:r>
+      <w:proofErr w:type="spellStart"/>
+      <w:r>
+        <w:t>paperaj</w:t>
+      </w:r>
+      <w:proofErr w:type="spellEnd"/>
+      <w:r>
+        <w:t>-keywords&gt;</w:t>
       </w:r>
     </w:p>
     <w:p/>
     <w:p>
       <w:r>
-        <w:t>&lt;paperaj-introduction&gt;</w:t>
+        <w:t>&lt;</w:t>
+      </w:r>
+      <w:proofErr w:type="spellStart"/>
+      <w:r>
+        <w:t>paperaj</w:t>
+      </w:r>
+      <w:proofErr w:type="spellEnd"/>
+      <w:r>
+        <w:t>-introduction&gt;</w:t>
       </w:r>
     </w:p>
     <w:p>
@@ -133,17 +219,47 @@
     </w:p>
     <w:p>
       <w:r>
-        <w:t>Mixed-methods research combines qualitative depth with quantitative breadth. Yet, integrating modalities often lacks transparency and reproducibility. Computational triangulation provides a principled bridge by aligning textual themes with numerical indicators. This article presents a compact demonstration, including data preparation, analytic steps, and reporting templates. We focus on practical decisions—preprocessing, model selection, and validation—so that researchers can adapt the workflow to diverse domains.</w:t>
-      </w:r>
-    </w:p>
-    <w:p>
-      <w:r>
-        <w:t>&lt;/paperaj-introduction&gt;</w:t>
-      </w:r>
-    </w:p>
-    <w:p>
-      <w:r>
-        <w:t>&lt;paperaj-methods&gt;</w:t>
+        <w:t>Mixed-methods research combines qualitative depth with quantitative breadth. Yet, integrating modalities often lacks transparency and reproducibility. Computational triangulation provides a principled bridge by aligning textual themes with numerical indicators. This article presents a compact demonstration, including data preparation, analytic steps, and reporting templates. We focus on practical decisions—preprocessing, model selection, and validation—so that researchers can adapt the workflow to diverse domains</w:t>
+      </w:r>
+      <w:r>
+        <w:t xml:space="preserve"> \</w:t>
+      </w:r>
+      <w:proofErr w:type="gramStart"/>
+      <w:r>
+        <w:t>cite{</w:t>
+      </w:r>
+      <w:proofErr w:type="gramEnd"/>
+      <w:r>
+        <w:t>Eapen2025}</w:t>
+      </w:r>
+      <w:r>
+        <w:t>.</w:t>
+      </w:r>
+    </w:p>
+    <w:p>
+      <w:r>
+        <w:t>&lt;/</w:t>
+      </w:r>
+      <w:proofErr w:type="spellStart"/>
+      <w:r>
+        <w:t>paperaj</w:t>
+      </w:r>
+      <w:proofErr w:type="spellEnd"/>
+      <w:r>
+        <w:t>-introduction&gt;</w:t>
+      </w:r>
+    </w:p>
+    <w:p>
+      <w:r>
+        <w:t>&lt;</w:t>
+      </w:r>
+      <w:proofErr w:type="spellStart"/>
+      <w:r>
+        <w:t>paperaj</w:t>
+      </w:r>
+      <w:proofErr w:type="spellEnd"/>
+      <w:r>
+        <w:t>-methods&gt;</w:t>
       </w:r>
     </w:p>
     <w:p>
@@ -159,7 +275,23 @@
         <w:keepNext/>
       </w:pPr>
       <w:r>
-        <w:t xml:space="preserve">2.1 Dataset: We constructed a synthetic corpus of 30 semi-structured interview excerpts and a survey of 240 respondents with five Likert-scale items (1–5). Demographics were limited to age bracket and occupation class to minimize identifiability. 2.2 Preprocessing: Text was lowercased, de-noised, and tokenized; stopwords were removed. Numerical scales were z-standardized. 2.3 Analyses: (a) Topic modeling (LDA, k=5) on interview excerpts; (b) Sentiment analysis using lexicon-based polarity; (c) Thematic coding with a three-code scheme (Access, Usability, Trust). 2.4 Triangulation: We computed concordance between topic prevalence and survey scale scores using </w:t>
+        <w:t xml:space="preserve">2.1 Dataset: We constructed a synthetic corpus of 30 semi-structured interview excerpts and a survey of 240 respondents with five Likert-scale items (1–5). Demographics were limited to age bracket and occupation class to minimize identifiability. 2.2 Preprocessing: Text was lowercased, de-noised, and tokenized; </w:t>
+      </w:r>
+      <w:proofErr w:type="spellStart"/>
+      <w:r>
+        <w:t>stopwords</w:t>
+      </w:r>
+      <w:proofErr w:type="spellEnd"/>
+      <w:r>
+        <w:t xml:space="preserve"> were removed. Numerical scales were </w:t>
+      </w:r>
+      <w:proofErr w:type="gramStart"/>
+      <w:r>
+        <w:t>z-standardized</w:t>
+      </w:r>
+      <w:proofErr w:type="gramEnd"/>
+      <w:r>
+        <w:t xml:space="preserve">. 2.3 Analyses: (a) Topic modeling (LDA, k=5) on interview excerpts; (b) Sentiment analysis using lexicon-based polarity; (c) Thematic coding with a three-code scheme (Access, Usability, Trust). 2.4 Triangulation: We computed concordance between topic prevalence and survey scale scores using </w:t>
       </w:r>
       <w:r>
         <w:lastRenderedPageBreak/>
@@ -220,26 +352,55 @@
       <w:r>
         <w:t xml:space="preserve">Figure </w:t>
       </w:r>
-      <w:fldSimple w:instr=" SEQ Figure \* ARABIC ">
-        <w:r>
-          <w:rPr>
-            <w:noProof/>
-          </w:rPr>
-          <w:t>1</w:t>
-        </w:r>
-      </w:fldSimple>
+      <w:r>
+        <w:fldChar w:fldCharType="begin"/>
+      </w:r>
+      <w:r>
+        <w:instrText xml:space="preserve"> SEQ Figure \* ARABIC </w:instrText>
+      </w:r>
+      <w:r>
+        <w:fldChar w:fldCharType="separate"/>
+      </w:r>
+      <w:r>
+        <w:rPr>
+          <w:noProof/>
+        </w:rPr>
+        <w:t>1</w:t>
+      </w:r>
+      <w:r>
+        <w:rPr>
+          <w:noProof/>
+        </w:rPr>
+        <w:fldChar w:fldCharType="end"/>
+      </w:r>
       <w:r>
         <w:t>: CRISP-T python package</w:t>
       </w:r>
     </w:p>
     <w:p>
       <w:r>
-        <w:t>&lt;/paperaj-methods&gt;</w:t>
-      </w:r>
-    </w:p>
-    <w:p>
-      <w:r>
-        <w:t>&lt;paperaj-results&gt;</w:t>
+        <w:t>&lt;/</w:t>
+      </w:r>
+      <w:proofErr w:type="spellStart"/>
+      <w:r>
+        <w:t>paperaj</w:t>
+      </w:r>
+      <w:proofErr w:type="spellEnd"/>
+      <w:r>
+        <w:t>-methods&gt;</w:t>
+      </w:r>
+    </w:p>
+    <w:p>
+      <w:r>
+        <w:t>&lt;</w:t>
+      </w:r>
+      <w:proofErr w:type="spellStart"/>
+      <w:r>
+        <w:t>paperaj</w:t>
+      </w:r>
+      <w:proofErr w:type="spellEnd"/>
+      <w:r>
+        <w:t>-results&gt;</w:t>
       </w:r>
     </w:p>
     <w:p>
@@ -252,7 +413,13 @@
     </w:p>
     <w:p>
       <w:r>
-        <w:t>3.1 Descriptive Statistics: Mean Likert scores ranged from 3.4 to 4.1 (SD 0.7–0.9). Interview excerpts averaged 120 words (SD 38). 3.2 Topic–Scale Associations: The “Usability” topic prevalence correlated with the usability scale (r=0.42, p&lt;0.01). Access-related themes showed weaker associations (r=0.18, ns). 3.3 Sentiment: Overall polarity skewed positive (mean 0.21), aligning with higher trust scores. 3.4 Concordance: Cross-modal agreement reached 78% when mapping themes to constructs via the codebook; disagreements clustered around ambiguous excerpts.</w:t>
+        <w:t>3.1 Descriptive Statistics: Mean Likert scores ranged from 3.4 to 4.1 (SD 0.7–0.9). Interview excerpts averaged 120 words (SD 38). 3.2 Topic–Scale Associations: The “Usability” topic prevalence correlated with the usability scale (r=0.42, p&lt;0.01). Access-related themes showed weaker associations (r=0.18, ns). 3.3 Sentiment: Overall polarity skewed positive (mean 0.21), aligning with higher trust scores. 3.4 Concordance: Cross-modal agreement reached 78% when mapping themes to constructs via the codebook; disagreements clustered around ambiguous excerpts</w:t>
+      </w:r>
+      <w:r>
+        <w:t xml:space="preserve"> \cite{Eapen2026}</w:t>
+      </w:r>
+      <w:r>
+        <w:t>.</w:t>
       </w:r>
     </w:p>
     <w:p/>
@@ -455,26 +622,55 @@
       <w:r>
         <w:t xml:space="preserve">Figure </w:t>
       </w:r>
-      <w:fldSimple w:instr=" SEQ Figure \* ARABIC ">
-        <w:r>
-          <w:rPr>
-            <w:noProof/>
-          </w:rPr>
-          <w:t>2</w:t>
-        </w:r>
-      </w:fldSimple>
+      <w:r>
+        <w:fldChar w:fldCharType="begin"/>
+      </w:r>
+      <w:r>
+        <w:instrText xml:space="preserve"> SEQ Figure \* ARABIC </w:instrText>
+      </w:r>
+      <w:r>
+        <w:fldChar w:fldCharType="separate"/>
+      </w:r>
+      <w:r>
+        <w:rPr>
+          <w:noProof/>
+        </w:rPr>
+        <w:t>2</w:t>
+      </w:r>
+      <w:r>
+        <w:rPr>
+          <w:noProof/>
+        </w:rPr>
+        <w:fldChar w:fldCharType="end"/>
+      </w:r>
       <w:r>
         <w:t>: Summary of results</w:t>
       </w:r>
     </w:p>
     <w:p>
       <w:r>
-        <w:t>&lt;/paperaj-results&gt;</w:t>
-      </w:r>
-    </w:p>
-    <w:p>
-      <w:r>
-        <w:t>&lt;paperaj-discussion&gt;</w:t>
+        <w:t>&lt;/</w:t>
+      </w:r>
+      <w:proofErr w:type="spellStart"/>
+      <w:r>
+        <w:t>paperaj</w:t>
+      </w:r>
+      <w:proofErr w:type="spellEnd"/>
+      <w:r>
+        <w:t>-results&gt;</w:t>
+      </w:r>
+    </w:p>
+    <w:p>
+      <w:r>
+        <w:t>&lt;</w:t>
+      </w:r>
+      <w:proofErr w:type="spellStart"/>
+      <w:r>
+        <w:t>paperaj</w:t>
+      </w:r>
+      <w:proofErr w:type="spellEnd"/>
+      <w:r>
+        <w:t>-discussion&gt;</w:t>
       </w:r>
     </w:p>
     <w:p>
@@ -492,12 +688,28 @@
     </w:p>
     <w:p>
       <w:r>
-        <w:t>&lt;/paperaj-discussion&gt;</w:t>
-      </w:r>
-    </w:p>
-    <w:p>
-      <w:r>
-        <w:t>&lt;paperaj-conclusion&gt;</w:t>
+        <w:t>&lt;/</w:t>
+      </w:r>
+      <w:proofErr w:type="spellStart"/>
+      <w:r>
+        <w:t>paperaj</w:t>
+      </w:r>
+      <w:proofErr w:type="spellEnd"/>
+      <w:r>
+        <w:t>-discussion&gt;</w:t>
+      </w:r>
+    </w:p>
+    <w:p>
+      <w:r>
+        <w:t>&lt;</w:t>
+      </w:r>
+      <w:proofErr w:type="spellStart"/>
+      <w:r>
+        <w:t>paperaj</w:t>
+      </w:r>
+      <w:proofErr w:type="spellEnd"/>
+      <w:r>
+        <w:t>-conclusion&gt;</w:t>
       </w:r>
     </w:p>
     <w:p>
@@ -515,13 +727,29 @@
     </w:p>
     <w:p>
       <w:r>
-        <w:t>&lt;/paperaj-conclusion&gt;</w:t>
+        <w:t>&lt;/</w:t>
+      </w:r>
+      <w:proofErr w:type="spellStart"/>
+      <w:r>
+        <w:t>paperaj</w:t>
+      </w:r>
+      <w:proofErr w:type="spellEnd"/>
+      <w:r>
+        <w:t>-conclusion&gt;</w:t>
       </w:r>
     </w:p>
     <w:p/>
     <w:p>
       <w:r>
-        <w:t>&lt;paperaj-acknowledgements&gt;</w:t>
+        <w:t>&lt;</w:t>
+      </w:r>
+      <w:proofErr w:type="spellStart"/>
+      <w:r>
+        <w:t>paperaj</w:t>
+      </w:r>
+      <w:proofErr w:type="spellEnd"/>
+      <w:r>
+        <w:t>-acknowledgements&gt;</w:t>
       </w:r>
     </w:p>
     <w:p/>
@@ -540,13 +768,29 @@
     </w:p>
     <w:p>
       <w:r>
-        <w:t>&lt;/paperaj-acknowledgements&gt;</w:t>
+        <w:t>&lt;/</w:t>
+      </w:r>
+      <w:proofErr w:type="spellStart"/>
+      <w:r>
+        <w:t>paperaj</w:t>
+      </w:r>
+      <w:proofErr w:type="spellEnd"/>
+      <w:r>
+        <w:t>-acknowledgements&gt;</w:t>
       </w:r>
     </w:p>
     <w:p>
       <w:r>
         <w:lastRenderedPageBreak/>
-        <w:t>&lt;paperaj-references&gt;</w:t>
+        <w:t>&lt;</w:t>
+      </w:r>
+      <w:proofErr w:type="spellStart"/>
+      <w:r>
+        <w:t>paperaj</w:t>
+      </w:r>
+      <w:proofErr w:type="spellEnd"/>
+      <w:r>
+        <w:t>-references&gt;</w:t>
       </w:r>
     </w:p>
     <w:p>
@@ -569,12 +813,28 @@
     </w:p>
     <w:p>
       <w:r>
-        <w:t>[3] Blei DM, Ng AY, Jordan MI. Latent Dirichlet Allocation. Journal of Machine Learning Research. 2003;3:993–1022.</w:t>
-      </w:r>
-    </w:p>
-    <w:p>
-      <w:r>
-        <w:t>&lt;/paperaj-references&gt;</w:t>
+        <w:t xml:space="preserve">[3] Blei DM, Ng AY, Jordan MI. Latent Dirichlet Allocation. Journal of Machine Learning Research. </w:t>
+      </w:r>
+      <w:proofErr w:type="gramStart"/>
+      <w:r>
+        <w:t>2003;3:993</w:t>
+      </w:r>
+      <w:proofErr w:type="gramEnd"/>
+      <w:r>
+        <w:t>–1022.</w:t>
+      </w:r>
+    </w:p>
+    <w:p>
+      <w:r>
+        <w:t>&lt;/</w:t>
+      </w:r>
+      <w:proofErr w:type="spellStart"/>
+      <w:r>
+        <w:t>paperaj</w:t>
+      </w:r>
+      <w:proofErr w:type="spellEnd"/>
+      <w:r>
+        <w:t>-references&gt;</w:t>
       </w:r>
     </w:p>
     <w:p/>

</xml_diff>

<commit_message>
docs: update installation instructions and usage examples in README.md
</commit_message>
<xml_diff>
--- a/test/paperaj.docx
+++ b/test/paperaj.docx
@@ -21,7 +21,7 @@
         <w:jc w:val="center"/>
       </w:pPr>
       <w:r>
-        <w:t>Computational Triangulation for Mixed-Methods Research: A Demonstration Study</w:t>
+        <w:t>A highly important and catchy title</w:t>
       </w:r>
     </w:p>
     <w:p>
@@ -124,13 +124,314 @@
     </w:p>
     <w:p>
       <w:r>
-        <w:t>Objective: To illustrate a reproducible workflow that integrates qualitative and quantitative data using computational triangulation. Methods: We developed a synthetic dataset combining survey responses (n=240) and interview excerpts (n=30). We applied topic modeling, sentiment analysis, and thematic coding, then triangulated findings via concordance indices. Results: Topic prevalence correlated with quantitative scale scores (r=0.42), and cross-modal agreement reached 78% across three thematic domains. Conclusions: The workflow enhances validity in mixed-methods studies and can be operationalized with open-source tools. The protocol and templates are shared for reuse.</w:t>
-      </w:r>
-      <w:r>
-        <w:t xml:space="preserve"> It is available here: </w:t>
-      </w:r>
-      <w:r>
-        <w:t>\</w:t>
+        <w:t xml:space="preserve">Lorem ipsum dolor </w:t>
+      </w:r>
+      <w:proofErr w:type="gramStart"/>
+      <w:r>
+        <w:t>sit</w:t>
+      </w:r>
+      <w:proofErr w:type="gramEnd"/>
+      <w:r>
+        <w:t xml:space="preserve"> </w:t>
+      </w:r>
+      <w:proofErr w:type="spellStart"/>
+      <w:r>
+        <w:t>amet</w:t>
+      </w:r>
+      <w:proofErr w:type="spellEnd"/>
+      <w:r>
+        <w:t xml:space="preserve"> </w:t>
+      </w:r>
+      <w:proofErr w:type="spellStart"/>
+      <w:r>
+        <w:t>consectetur</w:t>
+      </w:r>
+      <w:proofErr w:type="spellEnd"/>
+      <w:r>
+        <w:t xml:space="preserve"> </w:t>
+      </w:r>
+      <w:proofErr w:type="spellStart"/>
+      <w:r>
+        <w:t>adipiscing</w:t>
+      </w:r>
+      <w:proofErr w:type="spellEnd"/>
+      <w:r>
+        <w:t xml:space="preserve"> </w:t>
+      </w:r>
+      <w:proofErr w:type="spellStart"/>
+      <w:r>
+        <w:t>elit</w:t>
+      </w:r>
+      <w:proofErr w:type="spellEnd"/>
+      <w:r>
+        <w:t xml:space="preserve">. </w:t>
+      </w:r>
+      <w:proofErr w:type="spellStart"/>
+      <w:r>
+        <w:t>Quisque</w:t>
+      </w:r>
+      <w:proofErr w:type="spellEnd"/>
+      <w:r>
+        <w:t xml:space="preserve"> </w:t>
+      </w:r>
+      <w:proofErr w:type="spellStart"/>
+      <w:r>
+        <w:t>faucibus</w:t>
+      </w:r>
+      <w:proofErr w:type="spellEnd"/>
+      <w:r>
+        <w:t xml:space="preserve"> ex </w:t>
+      </w:r>
+      <w:proofErr w:type="spellStart"/>
+      <w:r>
+        <w:t>sapien</w:t>
+      </w:r>
+      <w:proofErr w:type="spellEnd"/>
+      <w:r>
+        <w:t xml:space="preserve"> vitae </w:t>
+      </w:r>
+      <w:proofErr w:type="spellStart"/>
+      <w:r>
+        <w:t>pellentesque</w:t>
+      </w:r>
+      <w:proofErr w:type="spellEnd"/>
+      <w:r>
+        <w:t xml:space="preserve"> </w:t>
+      </w:r>
+      <w:proofErr w:type="spellStart"/>
+      <w:r>
+        <w:t>sem</w:t>
+      </w:r>
+      <w:proofErr w:type="spellEnd"/>
+      <w:r>
+        <w:t xml:space="preserve"> </w:t>
+      </w:r>
+      <w:proofErr w:type="spellStart"/>
+      <w:r>
+        <w:t>placerat</w:t>
+      </w:r>
+      <w:proofErr w:type="spellEnd"/>
+      <w:r>
+        <w:t xml:space="preserve">. In id cursus mi </w:t>
+      </w:r>
+      <w:proofErr w:type="spellStart"/>
+      <w:r>
+        <w:t>pretium</w:t>
+      </w:r>
+      <w:proofErr w:type="spellEnd"/>
+      <w:r>
+        <w:t xml:space="preserve"> </w:t>
+      </w:r>
+      <w:proofErr w:type="spellStart"/>
+      <w:r>
+        <w:t>tellus</w:t>
+      </w:r>
+      <w:proofErr w:type="spellEnd"/>
+      <w:r>
+        <w:t xml:space="preserve"> </w:t>
+      </w:r>
+      <w:proofErr w:type="spellStart"/>
+      <w:r>
+        <w:t>duis</w:t>
+      </w:r>
+      <w:proofErr w:type="spellEnd"/>
+      <w:r>
+        <w:t xml:space="preserve"> convallis. Tempus </w:t>
+      </w:r>
+      <w:proofErr w:type="spellStart"/>
+      <w:r>
+        <w:t>leo</w:t>
+      </w:r>
+      <w:proofErr w:type="spellEnd"/>
+      <w:r>
+        <w:t xml:space="preserve"> </w:t>
+      </w:r>
+      <w:proofErr w:type="spellStart"/>
+      <w:r>
+        <w:t>eu</w:t>
+      </w:r>
+      <w:proofErr w:type="spellEnd"/>
+      <w:r>
+        <w:t xml:space="preserve"> </w:t>
+      </w:r>
+      <w:proofErr w:type="spellStart"/>
+      <w:r>
+        <w:t>aenean</w:t>
+      </w:r>
+      <w:proofErr w:type="spellEnd"/>
+      <w:r>
+        <w:t xml:space="preserve"> sed diam </w:t>
+      </w:r>
+      <w:proofErr w:type="spellStart"/>
+      <w:r>
+        <w:t>urna</w:t>
+      </w:r>
+      <w:proofErr w:type="spellEnd"/>
+      <w:r>
+        <w:t xml:space="preserve"> </w:t>
+      </w:r>
+      <w:proofErr w:type="spellStart"/>
+      <w:r>
+        <w:t>tempor</w:t>
+      </w:r>
+      <w:proofErr w:type="spellEnd"/>
+      <w:r>
+        <w:t xml:space="preserve">. Pulvinar </w:t>
+      </w:r>
+      <w:proofErr w:type="spellStart"/>
+      <w:r>
+        <w:t>vivamus</w:t>
+      </w:r>
+      <w:proofErr w:type="spellEnd"/>
+      <w:r>
+        <w:t xml:space="preserve"> </w:t>
+      </w:r>
+      <w:proofErr w:type="spellStart"/>
+      <w:r>
+        <w:t>fringilla</w:t>
+      </w:r>
+      <w:proofErr w:type="spellEnd"/>
+      <w:r>
+        <w:t xml:space="preserve"> </w:t>
+      </w:r>
+      <w:proofErr w:type="spellStart"/>
+      <w:r>
+        <w:t>lacus</w:t>
+      </w:r>
+      <w:proofErr w:type="spellEnd"/>
+      <w:r>
+        <w:t xml:space="preserve"> nec </w:t>
+      </w:r>
+      <w:proofErr w:type="spellStart"/>
+      <w:r>
+        <w:t>metus</w:t>
+      </w:r>
+      <w:proofErr w:type="spellEnd"/>
+      <w:r>
+        <w:t xml:space="preserve"> </w:t>
+      </w:r>
+      <w:proofErr w:type="spellStart"/>
+      <w:r>
+        <w:t>bibendum</w:t>
+      </w:r>
+      <w:proofErr w:type="spellEnd"/>
+      <w:r>
+        <w:t xml:space="preserve"> </w:t>
+      </w:r>
+      <w:proofErr w:type="spellStart"/>
+      <w:r>
+        <w:t>egestas</w:t>
+      </w:r>
+      <w:proofErr w:type="spellEnd"/>
+      <w:r>
+        <w:t xml:space="preserve">. Iaculis </w:t>
+      </w:r>
+      <w:proofErr w:type="spellStart"/>
+      <w:r>
+        <w:t>massa</w:t>
+      </w:r>
+      <w:proofErr w:type="spellEnd"/>
+      <w:r>
+        <w:t xml:space="preserve"> </w:t>
+      </w:r>
+      <w:proofErr w:type="spellStart"/>
+      <w:r>
+        <w:t>nisl</w:t>
+      </w:r>
+      <w:proofErr w:type="spellEnd"/>
+      <w:r>
+        <w:t xml:space="preserve"> </w:t>
+      </w:r>
+      <w:proofErr w:type="spellStart"/>
+      <w:r>
+        <w:t>malesuada</w:t>
+      </w:r>
+      <w:proofErr w:type="spellEnd"/>
+      <w:r>
+        <w:t xml:space="preserve"> lacinia integer nunc </w:t>
+      </w:r>
+      <w:proofErr w:type="spellStart"/>
+      <w:r>
+        <w:t>posuere</w:t>
+      </w:r>
+      <w:proofErr w:type="spellEnd"/>
+      <w:r>
+        <w:t xml:space="preserve">. Ut </w:t>
+      </w:r>
+      <w:proofErr w:type="spellStart"/>
+      <w:r>
+        <w:t>hendrerit</w:t>
+      </w:r>
+      <w:proofErr w:type="spellEnd"/>
+      <w:r>
+        <w:t xml:space="preserve"> semper vel class </w:t>
+      </w:r>
+      <w:proofErr w:type="spellStart"/>
+      <w:r>
+        <w:t>aptent</w:t>
+      </w:r>
+      <w:proofErr w:type="spellEnd"/>
+      <w:r>
+        <w:t xml:space="preserve"> </w:t>
+      </w:r>
+      <w:proofErr w:type="spellStart"/>
+      <w:r>
+        <w:t>taciti</w:t>
+      </w:r>
+      <w:proofErr w:type="spellEnd"/>
+      <w:r>
+        <w:t xml:space="preserve"> </w:t>
+      </w:r>
+      <w:proofErr w:type="spellStart"/>
+      <w:r>
+        <w:t>sociosqu</w:t>
+      </w:r>
+      <w:proofErr w:type="spellEnd"/>
+      <w:r>
+        <w:t xml:space="preserve">. Ad </w:t>
+      </w:r>
+      <w:proofErr w:type="spellStart"/>
+      <w:r>
+        <w:t>litora</w:t>
+      </w:r>
+      <w:proofErr w:type="spellEnd"/>
+      <w:r>
+        <w:t xml:space="preserve"> </w:t>
+      </w:r>
+      <w:proofErr w:type="spellStart"/>
+      <w:r>
+        <w:t>torquent</w:t>
+      </w:r>
+      <w:proofErr w:type="spellEnd"/>
+      <w:r>
+        <w:t xml:space="preserve"> per </w:t>
+      </w:r>
+      <w:proofErr w:type="spellStart"/>
+      <w:r>
+        <w:t>conubia</w:t>
+      </w:r>
+      <w:proofErr w:type="spellEnd"/>
+      <w:r>
+        <w:t xml:space="preserve"> nostra </w:t>
+      </w:r>
+      <w:proofErr w:type="spellStart"/>
+      <w:r>
+        <w:t>inceptos</w:t>
+      </w:r>
+      <w:proofErr w:type="spellEnd"/>
+      <w:r>
+        <w:t xml:space="preserve"> </w:t>
+      </w:r>
+      <w:proofErr w:type="spellStart"/>
+      <w:r>
+        <w:t>himenaeos</w:t>
+      </w:r>
+      <w:proofErr w:type="spellEnd"/>
+      <w:r>
+        <w:t>.</w:t>
+      </w:r>
+      <w:r>
+        <w:t xml:space="preserve"> It is available here: \</w:t>
       </w:r>
       <w:proofErr w:type="spellStart"/>
       <w:r>
@@ -138,7 +439,15 @@
       </w:r>
       <w:proofErr w:type="spellEnd"/>
       <w:r>
-        <w:t>{http://www.overleaf.com}{Something Linky}</w:t>
+        <w:t xml:space="preserve">{http://www.overleaf.com}{Something </w:t>
+      </w:r>
+      <w:proofErr w:type="spellStart"/>
+      <w:r>
+        <w:t>Linky</w:t>
+      </w:r>
+      <w:proofErr w:type="spellEnd"/>
+      <w:r>
+        <w:t>}</w:t>
       </w:r>
     </w:p>
     <w:p>
@@ -178,12 +487,11 @@
     </w:p>
     <w:p>
       <w:r>
-        <w:t>mixed methods; computational triangulation; qualitative analysis; topic modeling; sentiment analysis</w:t>
+        <w:t>mixed methods; topic modeling; sentiment analysis</w:t>
       </w:r>
     </w:p>
     <w:p>
       <w:r>
-        <w:lastRenderedPageBreak/>
         <w:t>&lt;/</w:t>
       </w:r>
       <w:proofErr w:type="spellStart"/>
@@ -214,13 +522,625 @@
         <w:pStyle w:val="Heading1"/>
       </w:pPr>
       <w:r>
+        <w:lastRenderedPageBreak/>
         <w:t>Introduction</w:t>
       </w:r>
     </w:p>
     <w:p>
       <w:r>
-        <w:t>Mixed-methods research combines qualitative depth with quantitative breadth. Yet, integrating modalities often lacks transparency and reproducibility. Computational triangulation provides a principled bridge by aligning textual themes with numerical indicators. This article presents a compact demonstration, including data preparation, analytic steps, and reporting templates. We focus on practical decisions—preprocessing, model selection, and validation—so that researchers can adapt the workflow to diverse domains</w:t>
-      </w:r>
+        <w:t xml:space="preserve">Lorem ipsum dolor </w:t>
+      </w:r>
+      <w:proofErr w:type="gramStart"/>
+      <w:r>
+        <w:t>sit</w:t>
+      </w:r>
+      <w:proofErr w:type="gramEnd"/>
+      <w:r>
+        <w:t xml:space="preserve"> </w:t>
+      </w:r>
+      <w:proofErr w:type="spellStart"/>
+      <w:r>
+        <w:t>amet</w:t>
+      </w:r>
+      <w:proofErr w:type="spellEnd"/>
+      <w:r>
+        <w:t xml:space="preserve"> </w:t>
+      </w:r>
+      <w:proofErr w:type="spellStart"/>
+      <w:r>
+        <w:t>consectetur</w:t>
+      </w:r>
+      <w:proofErr w:type="spellEnd"/>
+      <w:r>
+        <w:t xml:space="preserve"> </w:t>
+      </w:r>
+      <w:proofErr w:type="spellStart"/>
+      <w:r>
+        <w:t>adipiscing</w:t>
+      </w:r>
+      <w:proofErr w:type="spellEnd"/>
+      <w:r>
+        <w:t xml:space="preserve"> </w:t>
+      </w:r>
+      <w:proofErr w:type="spellStart"/>
+      <w:r>
+        <w:t>elit</w:t>
+      </w:r>
+      <w:proofErr w:type="spellEnd"/>
+      <w:r>
+        <w:t xml:space="preserve">. </w:t>
+      </w:r>
+      <w:proofErr w:type="spellStart"/>
+      <w:r>
+        <w:t>Quisque</w:t>
+      </w:r>
+      <w:proofErr w:type="spellEnd"/>
+      <w:r>
+        <w:t xml:space="preserve"> </w:t>
+      </w:r>
+      <w:proofErr w:type="spellStart"/>
+      <w:r>
+        <w:t>faucibus</w:t>
+      </w:r>
+      <w:proofErr w:type="spellEnd"/>
+      <w:r>
+        <w:t xml:space="preserve"> ex </w:t>
+      </w:r>
+      <w:proofErr w:type="spellStart"/>
+      <w:r>
+        <w:t>sapien</w:t>
+      </w:r>
+      <w:proofErr w:type="spellEnd"/>
+      <w:r>
+        <w:t xml:space="preserve"> vitae </w:t>
+      </w:r>
+      <w:proofErr w:type="spellStart"/>
+      <w:r>
+        <w:t>pellentesque</w:t>
+      </w:r>
+      <w:proofErr w:type="spellEnd"/>
+      <w:r>
+        <w:t xml:space="preserve"> </w:t>
+      </w:r>
+      <w:proofErr w:type="spellStart"/>
+      <w:r>
+        <w:t>sem</w:t>
+      </w:r>
+      <w:proofErr w:type="spellEnd"/>
+      <w:r>
+        <w:t xml:space="preserve"> </w:t>
+      </w:r>
+      <w:proofErr w:type="spellStart"/>
+      <w:r>
+        <w:t>placerat</w:t>
+      </w:r>
+      <w:proofErr w:type="spellEnd"/>
+      <w:r>
+        <w:t xml:space="preserve">. In id cursus mi </w:t>
+      </w:r>
+      <w:proofErr w:type="spellStart"/>
+      <w:r>
+        <w:t>pretium</w:t>
+      </w:r>
+      <w:proofErr w:type="spellEnd"/>
+      <w:r>
+        <w:t xml:space="preserve"> </w:t>
+      </w:r>
+      <w:proofErr w:type="spellStart"/>
+      <w:r>
+        <w:t>tellus</w:t>
+      </w:r>
+      <w:proofErr w:type="spellEnd"/>
+      <w:r>
+        <w:t xml:space="preserve"> </w:t>
+      </w:r>
+      <w:proofErr w:type="spellStart"/>
+      <w:r>
+        <w:t>duis</w:t>
+      </w:r>
+      <w:proofErr w:type="spellEnd"/>
+      <w:r>
+        <w:t xml:space="preserve"> convallis. Tempus </w:t>
+      </w:r>
+      <w:proofErr w:type="spellStart"/>
+      <w:r>
+        <w:t>leo</w:t>
+      </w:r>
+      <w:proofErr w:type="spellEnd"/>
+      <w:r>
+        <w:t xml:space="preserve"> </w:t>
+      </w:r>
+      <w:proofErr w:type="spellStart"/>
+      <w:r>
+        <w:t>eu</w:t>
+      </w:r>
+      <w:proofErr w:type="spellEnd"/>
+      <w:r>
+        <w:t xml:space="preserve"> </w:t>
+      </w:r>
+      <w:proofErr w:type="spellStart"/>
+      <w:r>
+        <w:t>aenean</w:t>
+      </w:r>
+      <w:proofErr w:type="spellEnd"/>
+      <w:r>
+        <w:t xml:space="preserve"> sed diam </w:t>
+      </w:r>
+      <w:proofErr w:type="spellStart"/>
+      <w:r>
+        <w:t>urna</w:t>
+      </w:r>
+      <w:proofErr w:type="spellEnd"/>
+      <w:r>
+        <w:t xml:space="preserve"> </w:t>
+      </w:r>
+      <w:proofErr w:type="spellStart"/>
+      <w:r>
+        <w:t>tempor</w:t>
+      </w:r>
+      <w:proofErr w:type="spellEnd"/>
+      <w:r>
+        <w:t xml:space="preserve">. Pulvinar </w:t>
+      </w:r>
+      <w:proofErr w:type="spellStart"/>
+      <w:r>
+        <w:t>vivamus</w:t>
+      </w:r>
+      <w:proofErr w:type="spellEnd"/>
+      <w:r>
+        <w:t xml:space="preserve"> </w:t>
+      </w:r>
+      <w:proofErr w:type="spellStart"/>
+      <w:r>
+        <w:t>fringilla</w:t>
+      </w:r>
+      <w:proofErr w:type="spellEnd"/>
+      <w:r>
+        <w:t xml:space="preserve"> </w:t>
+      </w:r>
+      <w:proofErr w:type="spellStart"/>
+      <w:r>
+        <w:t>lacus</w:t>
+      </w:r>
+      <w:proofErr w:type="spellEnd"/>
+      <w:r>
+        <w:t xml:space="preserve"> nec </w:t>
+      </w:r>
+      <w:proofErr w:type="spellStart"/>
+      <w:r>
+        <w:t>metus</w:t>
+      </w:r>
+      <w:proofErr w:type="spellEnd"/>
+      <w:r>
+        <w:t xml:space="preserve"> </w:t>
+      </w:r>
+      <w:proofErr w:type="spellStart"/>
+      <w:r>
+        <w:t>bibendum</w:t>
+      </w:r>
+      <w:proofErr w:type="spellEnd"/>
+      <w:r>
+        <w:t xml:space="preserve"> </w:t>
+      </w:r>
+      <w:proofErr w:type="spellStart"/>
+      <w:r>
+        <w:t>egestas</w:t>
+      </w:r>
+      <w:proofErr w:type="spellEnd"/>
+      <w:r>
+        <w:t xml:space="preserve">. Iaculis </w:t>
+      </w:r>
+      <w:proofErr w:type="spellStart"/>
+      <w:r>
+        <w:t>massa</w:t>
+      </w:r>
+      <w:proofErr w:type="spellEnd"/>
+      <w:r>
+        <w:t xml:space="preserve"> </w:t>
+      </w:r>
+      <w:proofErr w:type="spellStart"/>
+      <w:r>
+        <w:t>nisl</w:t>
+      </w:r>
+      <w:proofErr w:type="spellEnd"/>
+      <w:r>
+        <w:t xml:space="preserve"> </w:t>
+      </w:r>
+      <w:proofErr w:type="spellStart"/>
+      <w:r>
+        <w:t>malesuada</w:t>
+      </w:r>
+      <w:proofErr w:type="spellEnd"/>
+      <w:r>
+        <w:t xml:space="preserve"> lacinia integer nunc </w:t>
+      </w:r>
+      <w:proofErr w:type="spellStart"/>
+      <w:r>
+        <w:t>posuere</w:t>
+      </w:r>
+      <w:proofErr w:type="spellEnd"/>
+      <w:r>
+        <w:t xml:space="preserve">. Ut </w:t>
+      </w:r>
+      <w:proofErr w:type="spellStart"/>
+      <w:r>
+        <w:t>hendrerit</w:t>
+      </w:r>
+      <w:proofErr w:type="spellEnd"/>
+      <w:r>
+        <w:t xml:space="preserve"> semper vel class </w:t>
+      </w:r>
+      <w:proofErr w:type="spellStart"/>
+      <w:r>
+        <w:t>aptent</w:t>
+      </w:r>
+      <w:proofErr w:type="spellEnd"/>
+      <w:r>
+        <w:t xml:space="preserve"> </w:t>
+      </w:r>
+      <w:proofErr w:type="spellStart"/>
+      <w:r>
+        <w:t>taciti</w:t>
+      </w:r>
+      <w:proofErr w:type="spellEnd"/>
+      <w:r>
+        <w:t xml:space="preserve"> </w:t>
+      </w:r>
+      <w:proofErr w:type="spellStart"/>
+      <w:r>
+        <w:t>sociosqu</w:t>
+      </w:r>
+      <w:proofErr w:type="spellEnd"/>
+      <w:r>
+        <w:t xml:space="preserve">. Ad </w:t>
+      </w:r>
+      <w:proofErr w:type="spellStart"/>
+      <w:r>
+        <w:t>litora</w:t>
+      </w:r>
+      <w:proofErr w:type="spellEnd"/>
+      <w:r>
+        <w:t xml:space="preserve"> </w:t>
+      </w:r>
+      <w:proofErr w:type="spellStart"/>
+      <w:r>
+        <w:t>torquent</w:t>
+      </w:r>
+      <w:proofErr w:type="spellEnd"/>
+      <w:r>
+        <w:t xml:space="preserve"> per </w:t>
+      </w:r>
+      <w:proofErr w:type="spellStart"/>
+      <w:r>
+        <w:t>conubia</w:t>
+      </w:r>
+      <w:proofErr w:type="spellEnd"/>
+      <w:r>
+        <w:t xml:space="preserve"> nostra </w:t>
+      </w:r>
+      <w:proofErr w:type="spellStart"/>
+      <w:r>
+        <w:t>inceptos</w:t>
+      </w:r>
+      <w:proofErr w:type="spellEnd"/>
+      <w:r>
+        <w:t xml:space="preserve"> </w:t>
+      </w:r>
+      <w:proofErr w:type="spellStart"/>
+      <w:r>
+        <w:t>himenaeos</w:t>
+      </w:r>
+      <w:proofErr w:type="spellEnd"/>
+      <w:r>
+        <w:t>.</w:t>
+      </w:r>
+    </w:p>
+    <w:p/>
+    <w:p>
+      <w:r>
+        <w:t xml:space="preserve">Lorem ipsum dolor </w:t>
+      </w:r>
+      <w:proofErr w:type="gramStart"/>
+      <w:r>
+        <w:t>sit</w:t>
+      </w:r>
+      <w:proofErr w:type="gramEnd"/>
+      <w:r>
+        <w:t xml:space="preserve"> </w:t>
+      </w:r>
+      <w:proofErr w:type="spellStart"/>
+      <w:r>
+        <w:t>amet</w:t>
+      </w:r>
+      <w:proofErr w:type="spellEnd"/>
+      <w:r>
+        <w:t xml:space="preserve"> </w:t>
+      </w:r>
+      <w:proofErr w:type="spellStart"/>
+      <w:r>
+        <w:t>consectetur</w:t>
+      </w:r>
+      <w:proofErr w:type="spellEnd"/>
+      <w:r>
+        <w:t xml:space="preserve"> </w:t>
+      </w:r>
+      <w:proofErr w:type="spellStart"/>
+      <w:r>
+        <w:t>adipiscing</w:t>
+      </w:r>
+      <w:proofErr w:type="spellEnd"/>
+      <w:r>
+        <w:t xml:space="preserve"> </w:t>
+      </w:r>
+      <w:proofErr w:type="spellStart"/>
+      <w:r>
+        <w:t>elit</w:t>
+      </w:r>
+      <w:proofErr w:type="spellEnd"/>
+      <w:r>
+        <w:t xml:space="preserve">. </w:t>
+      </w:r>
+      <w:proofErr w:type="spellStart"/>
+      <w:r>
+        <w:t>Quisque</w:t>
+      </w:r>
+      <w:proofErr w:type="spellEnd"/>
+      <w:r>
+        <w:t xml:space="preserve"> </w:t>
+      </w:r>
+      <w:proofErr w:type="spellStart"/>
+      <w:r>
+        <w:t>faucibus</w:t>
+      </w:r>
+      <w:proofErr w:type="spellEnd"/>
+      <w:r>
+        <w:t xml:space="preserve"> ex </w:t>
+      </w:r>
+      <w:proofErr w:type="spellStart"/>
+      <w:r>
+        <w:t>sapien</w:t>
+      </w:r>
+      <w:proofErr w:type="spellEnd"/>
+      <w:r>
+        <w:t xml:space="preserve"> vitae </w:t>
+      </w:r>
+      <w:proofErr w:type="spellStart"/>
+      <w:r>
+        <w:t>pellentesque</w:t>
+      </w:r>
+      <w:proofErr w:type="spellEnd"/>
+      <w:r>
+        <w:t xml:space="preserve"> </w:t>
+      </w:r>
+      <w:proofErr w:type="spellStart"/>
+      <w:r>
+        <w:t>sem</w:t>
+      </w:r>
+      <w:proofErr w:type="spellEnd"/>
+      <w:r>
+        <w:t xml:space="preserve"> </w:t>
+      </w:r>
+      <w:proofErr w:type="spellStart"/>
+      <w:r>
+        <w:t>placerat</w:t>
+      </w:r>
+      <w:proofErr w:type="spellEnd"/>
+      <w:r>
+        <w:t xml:space="preserve">. In id cursus mi </w:t>
+      </w:r>
+      <w:proofErr w:type="spellStart"/>
+      <w:r>
+        <w:t>pretium</w:t>
+      </w:r>
+      <w:proofErr w:type="spellEnd"/>
+      <w:r>
+        <w:t xml:space="preserve"> </w:t>
+      </w:r>
+      <w:proofErr w:type="spellStart"/>
+      <w:r>
+        <w:t>tellus</w:t>
+      </w:r>
+      <w:proofErr w:type="spellEnd"/>
+      <w:r>
+        <w:t xml:space="preserve"> </w:t>
+      </w:r>
+      <w:proofErr w:type="spellStart"/>
+      <w:r>
+        <w:t>duis</w:t>
+      </w:r>
+      <w:proofErr w:type="spellEnd"/>
+      <w:r>
+        <w:t xml:space="preserve"> convallis. Tempus </w:t>
+      </w:r>
+      <w:proofErr w:type="spellStart"/>
+      <w:r>
+        <w:t>leo</w:t>
+      </w:r>
+      <w:proofErr w:type="spellEnd"/>
+      <w:r>
+        <w:t xml:space="preserve"> </w:t>
+      </w:r>
+      <w:proofErr w:type="spellStart"/>
+      <w:r>
+        <w:t>eu</w:t>
+      </w:r>
+      <w:proofErr w:type="spellEnd"/>
+      <w:r>
+        <w:t xml:space="preserve"> </w:t>
+      </w:r>
+      <w:proofErr w:type="spellStart"/>
+      <w:r>
+        <w:t>aenean</w:t>
+      </w:r>
+      <w:proofErr w:type="spellEnd"/>
+      <w:r>
+        <w:t xml:space="preserve"> sed diam </w:t>
+      </w:r>
+      <w:proofErr w:type="spellStart"/>
+      <w:r>
+        <w:t>urna</w:t>
+      </w:r>
+      <w:proofErr w:type="spellEnd"/>
+      <w:r>
+        <w:t xml:space="preserve"> </w:t>
+      </w:r>
+      <w:proofErr w:type="spellStart"/>
+      <w:r>
+        <w:t>tempor</w:t>
+      </w:r>
+      <w:proofErr w:type="spellEnd"/>
+      <w:r>
+        <w:t xml:space="preserve">. Pulvinar </w:t>
+      </w:r>
+      <w:proofErr w:type="spellStart"/>
+      <w:r>
+        <w:t>vivamus</w:t>
+      </w:r>
+      <w:proofErr w:type="spellEnd"/>
+      <w:r>
+        <w:t xml:space="preserve"> </w:t>
+      </w:r>
+      <w:proofErr w:type="spellStart"/>
+      <w:r>
+        <w:t>fringilla</w:t>
+      </w:r>
+      <w:proofErr w:type="spellEnd"/>
+      <w:r>
+        <w:t xml:space="preserve"> </w:t>
+      </w:r>
+      <w:proofErr w:type="spellStart"/>
+      <w:r>
+        <w:t>lacus</w:t>
+      </w:r>
+      <w:proofErr w:type="spellEnd"/>
+      <w:r>
+        <w:t xml:space="preserve"> nec </w:t>
+      </w:r>
+      <w:proofErr w:type="spellStart"/>
+      <w:r>
+        <w:t>metus</w:t>
+      </w:r>
+      <w:proofErr w:type="spellEnd"/>
+      <w:r>
+        <w:t xml:space="preserve"> </w:t>
+      </w:r>
+      <w:proofErr w:type="spellStart"/>
+      <w:r>
+        <w:t>bibendum</w:t>
+      </w:r>
+      <w:proofErr w:type="spellEnd"/>
+      <w:r>
+        <w:t xml:space="preserve"> </w:t>
+      </w:r>
+      <w:proofErr w:type="spellStart"/>
+      <w:r>
+        <w:t>egestas</w:t>
+      </w:r>
+      <w:proofErr w:type="spellEnd"/>
+      <w:r>
+        <w:t xml:space="preserve">. Iaculis </w:t>
+      </w:r>
+      <w:proofErr w:type="spellStart"/>
+      <w:r>
+        <w:t>massa</w:t>
+      </w:r>
+      <w:proofErr w:type="spellEnd"/>
+      <w:r>
+        <w:t xml:space="preserve"> </w:t>
+      </w:r>
+      <w:proofErr w:type="spellStart"/>
+      <w:r>
+        <w:t>nisl</w:t>
+      </w:r>
+      <w:proofErr w:type="spellEnd"/>
+      <w:r>
+        <w:t xml:space="preserve"> </w:t>
+      </w:r>
+      <w:proofErr w:type="spellStart"/>
+      <w:r>
+        <w:t>malesuada</w:t>
+      </w:r>
+      <w:proofErr w:type="spellEnd"/>
+      <w:r>
+        <w:t xml:space="preserve"> lacinia integer nunc </w:t>
+      </w:r>
+      <w:proofErr w:type="spellStart"/>
+      <w:r>
+        <w:t>posuere</w:t>
+      </w:r>
+      <w:proofErr w:type="spellEnd"/>
+      <w:r>
+        <w:t xml:space="preserve">. Ut </w:t>
+      </w:r>
+      <w:proofErr w:type="spellStart"/>
+      <w:r>
+        <w:t>hendrerit</w:t>
+      </w:r>
+      <w:proofErr w:type="spellEnd"/>
+      <w:r>
+        <w:t xml:space="preserve"> semper vel class </w:t>
+      </w:r>
+      <w:proofErr w:type="spellStart"/>
+      <w:r>
+        <w:t>aptent</w:t>
+      </w:r>
+      <w:proofErr w:type="spellEnd"/>
+      <w:r>
+        <w:t xml:space="preserve"> </w:t>
+      </w:r>
+      <w:proofErr w:type="spellStart"/>
+      <w:r>
+        <w:t>taciti</w:t>
+      </w:r>
+      <w:proofErr w:type="spellEnd"/>
+      <w:r>
+        <w:t xml:space="preserve"> </w:t>
+      </w:r>
+      <w:proofErr w:type="spellStart"/>
+      <w:r>
+        <w:t>sociosqu</w:t>
+      </w:r>
+      <w:proofErr w:type="spellEnd"/>
+      <w:r>
+        <w:t xml:space="preserve">. Ad </w:t>
+      </w:r>
+      <w:proofErr w:type="spellStart"/>
+      <w:r>
+        <w:t>litora</w:t>
+      </w:r>
+      <w:proofErr w:type="spellEnd"/>
+      <w:r>
+        <w:t xml:space="preserve"> </w:t>
+      </w:r>
+      <w:proofErr w:type="spellStart"/>
+      <w:r>
+        <w:t>torquent</w:t>
+      </w:r>
+      <w:proofErr w:type="spellEnd"/>
+      <w:r>
+        <w:t xml:space="preserve"> per </w:t>
+      </w:r>
+      <w:proofErr w:type="spellStart"/>
+      <w:r>
+        <w:t>conubia</w:t>
+      </w:r>
+      <w:proofErr w:type="spellEnd"/>
+      <w:r>
+        <w:t xml:space="preserve"> nostra </w:t>
+      </w:r>
+      <w:proofErr w:type="spellStart"/>
+      <w:r>
+        <w:t>inceptos</w:t>
+      </w:r>
+      <w:proofErr w:type="spellEnd"/>
+      <w:r>
+        <w:t xml:space="preserve"> </w:t>
+      </w:r>
+      <w:proofErr w:type="spellStart"/>
+      <w:r>
+        <w:t>himenaeos</w:t>
+      </w:r>
+      <w:proofErr w:type="spellEnd"/>
       <w:r>
         <w:t xml:space="preserve"> \</w:t>
       </w:r>
@@ -275,27 +1195,952 @@
         <w:keepNext/>
       </w:pPr>
       <w:r>
-        <w:t xml:space="preserve">2.1 Dataset: We constructed a synthetic corpus of 30 semi-structured interview excerpts and a survey of 240 respondents with five Likert-scale items (1–5). Demographics were limited to age bracket and occupation class to minimize identifiability. 2.2 Preprocessing: Text was lowercased, de-noised, and tokenized; </w:t>
-      </w:r>
-      <w:proofErr w:type="spellStart"/>
-      <w:r>
-        <w:t>stopwords</w:t>
-      </w:r>
-      <w:proofErr w:type="spellEnd"/>
-      <w:r>
-        <w:t xml:space="preserve"> were removed. Numerical scales were </w:t>
+        <w:t xml:space="preserve">Lorem ipsum dolor </w:t>
       </w:r>
       <w:proofErr w:type="gramStart"/>
       <w:r>
-        <w:t>z-standardized</w:t>
+        <w:t>sit</w:t>
       </w:r>
       <w:proofErr w:type="gramEnd"/>
       <w:r>
-        <w:t xml:space="preserve">. 2.3 Analyses: (a) Topic modeling (LDA, k=5) on interview excerpts; (b) Sentiment analysis using lexicon-based polarity; (c) Thematic coding with a three-code scheme (Access, Usability, Trust). 2.4 Triangulation: We computed concordance between topic prevalence and survey scale scores using </w:t>
-      </w:r>
+        <w:t xml:space="preserve"> </w:t>
+      </w:r>
+      <w:proofErr w:type="spellStart"/>
+      <w:r>
+        <w:t>amet</w:t>
+      </w:r>
+      <w:proofErr w:type="spellEnd"/>
+      <w:r>
+        <w:t xml:space="preserve"> </w:t>
+      </w:r>
+      <w:proofErr w:type="spellStart"/>
+      <w:r>
+        <w:t>consectetur</w:t>
+      </w:r>
+      <w:proofErr w:type="spellEnd"/>
+      <w:r>
+        <w:t xml:space="preserve"> </w:t>
+      </w:r>
+      <w:proofErr w:type="spellStart"/>
+      <w:r>
+        <w:t>adipiscing</w:t>
+      </w:r>
+      <w:proofErr w:type="spellEnd"/>
+      <w:r>
+        <w:t xml:space="preserve"> </w:t>
+      </w:r>
+      <w:proofErr w:type="spellStart"/>
+      <w:r>
+        <w:t>elit</w:t>
+      </w:r>
+      <w:proofErr w:type="spellEnd"/>
+      <w:r>
+        <w:t xml:space="preserve">. </w:t>
+      </w:r>
+      <w:proofErr w:type="spellStart"/>
+      <w:r>
+        <w:t>Quisque</w:t>
+      </w:r>
+      <w:proofErr w:type="spellEnd"/>
+      <w:r>
+        <w:t xml:space="preserve"> </w:t>
+      </w:r>
+      <w:proofErr w:type="spellStart"/>
+      <w:r>
+        <w:t>faucibus</w:t>
+      </w:r>
+      <w:proofErr w:type="spellEnd"/>
+      <w:r>
+        <w:t xml:space="preserve"> ex </w:t>
+      </w:r>
+      <w:proofErr w:type="spellStart"/>
+      <w:r>
+        <w:t>sapien</w:t>
+      </w:r>
+      <w:proofErr w:type="spellEnd"/>
+      <w:r>
+        <w:t xml:space="preserve"> vitae </w:t>
+      </w:r>
+      <w:proofErr w:type="spellStart"/>
+      <w:r>
+        <w:t>pellentesque</w:t>
+      </w:r>
+      <w:proofErr w:type="spellEnd"/>
+      <w:r>
+        <w:t xml:space="preserve"> </w:t>
+      </w:r>
+      <w:proofErr w:type="spellStart"/>
+      <w:r>
+        <w:t>sem</w:t>
+      </w:r>
+      <w:proofErr w:type="spellEnd"/>
+      <w:r>
+        <w:t xml:space="preserve"> </w:t>
+      </w:r>
+      <w:proofErr w:type="spellStart"/>
+      <w:r>
+        <w:t>placerat</w:t>
+      </w:r>
+      <w:proofErr w:type="spellEnd"/>
+      <w:r>
+        <w:t xml:space="preserve">. In id cursus mi </w:t>
+      </w:r>
+      <w:proofErr w:type="spellStart"/>
+      <w:r>
+        <w:t>pretium</w:t>
+      </w:r>
+      <w:proofErr w:type="spellEnd"/>
+      <w:r>
+        <w:t xml:space="preserve"> </w:t>
+      </w:r>
+      <w:proofErr w:type="spellStart"/>
+      <w:r>
+        <w:t>tellus</w:t>
+      </w:r>
+      <w:proofErr w:type="spellEnd"/>
+      <w:r>
+        <w:t xml:space="preserve"> </w:t>
+      </w:r>
+      <w:proofErr w:type="spellStart"/>
+      <w:r>
+        <w:t>duis</w:t>
+      </w:r>
+      <w:proofErr w:type="spellEnd"/>
+      <w:r>
+        <w:t xml:space="preserve"> convallis. Tempus </w:t>
+      </w:r>
+      <w:proofErr w:type="spellStart"/>
+      <w:r>
+        <w:t>leo</w:t>
+      </w:r>
+      <w:proofErr w:type="spellEnd"/>
+      <w:r>
+        <w:t xml:space="preserve"> </w:t>
+      </w:r>
+      <w:proofErr w:type="spellStart"/>
+      <w:r>
+        <w:t>eu</w:t>
+      </w:r>
+      <w:proofErr w:type="spellEnd"/>
+      <w:r>
+        <w:t xml:space="preserve"> </w:t>
+      </w:r>
+      <w:proofErr w:type="spellStart"/>
+      <w:r>
+        <w:t>aenean</w:t>
+      </w:r>
+      <w:proofErr w:type="spellEnd"/>
+      <w:r>
+        <w:t xml:space="preserve"> sed diam </w:t>
+      </w:r>
+      <w:proofErr w:type="spellStart"/>
+      <w:r>
+        <w:t>urna</w:t>
+      </w:r>
+      <w:proofErr w:type="spellEnd"/>
+      <w:r>
+        <w:t xml:space="preserve"> </w:t>
+      </w:r>
+      <w:proofErr w:type="spellStart"/>
+      <w:r>
+        <w:t>tempor</w:t>
+      </w:r>
+      <w:proofErr w:type="spellEnd"/>
+      <w:r>
+        <w:t xml:space="preserve">. Pulvinar </w:t>
+      </w:r>
+      <w:proofErr w:type="spellStart"/>
+      <w:r>
+        <w:t>vivamus</w:t>
+      </w:r>
+      <w:proofErr w:type="spellEnd"/>
+      <w:r>
+        <w:t xml:space="preserve"> </w:t>
+      </w:r>
+      <w:proofErr w:type="spellStart"/>
+      <w:r>
+        <w:t>fringilla</w:t>
+      </w:r>
+      <w:proofErr w:type="spellEnd"/>
+      <w:r>
+        <w:t xml:space="preserve"> </w:t>
+      </w:r>
+      <w:proofErr w:type="spellStart"/>
+      <w:r>
+        <w:t>lacus</w:t>
+      </w:r>
+      <w:proofErr w:type="spellEnd"/>
+      <w:r>
+        <w:t xml:space="preserve"> nec </w:t>
+      </w:r>
+      <w:proofErr w:type="spellStart"/>
+      <w:r>
+        <w:t>metus</w:t>
+      </w:r>
+      <w:proofErr w:type="spellEnd"/>
+      <w:r>
+        <w:t xml:space="preserve"> </w:t>
+      </w:r>
+      <w:proofErr w:type="spellStart"/>
+      <w:r>
+        <w:t>bibendum</w:t>
+      </w:r>
+      <w:proofErr w:type="spellEnd"/>
+      <w:r>
+        <w:t xml:space="preserve"> </w:t>
+      </w:r>
+      <w:proofErr w:type="spellStart"/>
+      <w:r>
+        <w:t>egestas</w:t>
+      </w:r>
+      <w:proofErr w:type="spellEnd"/>
+      <w:r>
+        <w:t xml:space="preserve">. Iaculis </w:t>
+      </w:r>
+      <w:proofErr w:type="spellStart"/>
+      <w:r>
+        <w:t>massa</w:t>
+      </w:r>
+      <w:proofErr w:type="spellEnd"/>
+      <w:r>
+        <w:t xml:space="preserve"> </w:t>
+      </w:r>
+      <w:proofErr w:type="spellStart"/>
+      <w:r>
+        <w:t>nisl</w:t>
+      </w:r>
+      <w:proofErr w:type="spellEnd"/>
+      <w:r>
+        <w:t xml:space="preserve"> </w:t>
+      </w:r>
+      <w:proofErr w:type="spellStart"/>
+      <w:r>
+        <w:t>malesuada</w:t>
+      </w:r>
+      <w:proofErr w:type="spellEnd"/>
+      <w:r>
+        <w:t xml:space="preserve"> lacinia integer nunc </w:t>
+      </w:r>
+      <w:proofErr w:type="spellStart"/>
+      <w:r>
+        <w:t>posuere</w:t>
+      </w:r>
+      <w:proofErr w:type="spellEnd"/>
+      <w:r>
+        <w:t xml:space="preserve">. Ut </w:t>
+      </w:r>
+      <w:proofErr w:type="spellStart"/>
+      <w:r>
+        <w:t>hendrerit</w:t>
+      </w:r>
+      <w:proofErr w:type="spellEnd"/>
+      <w:r>
+        <w:t xml:space="preserve"> semper vel class </w:t>
+      </w:r>
+      <w:proofErr w:type="spellStart"/>
+      <w:r>
+        <w:t>aptent</w:t>
+      </w:r>
+      <w:proofErr w:type="spellEnd"/>
+      <w:r>
+        <w:t xml:space="preserve"> </w:t>
+      </w:r>
+      <w:proofErr w:type="spellStart"/>
+      <w:r>
+        <w:t>taciti</w:t>
+      </w:r>
+      <w:proofErr w:type="spellEnd"/>
+      <w:r>
+        <w:t xml:space="preserve"> </w:t>
+      </w:r>
+      <w:proofErr w:type="spellStart"/>
+      <w:r>
+        <w:t>sociosqu</w:t>
+      </w:r>
+      <w:proofErr w:type="spellEnd"/>
+      <w:r>
+        <w:t xml:space="preserve">. Ad </w:t>
+      </w:r>
+      <w:proofErr w:type="spellStart"/>
+      <w:r>
+        <w:t>litora</w:t>
+      </w:r>
+      <w:proofErr w:type="spellEnd"/>
+      <w:r>
+        <w:t xml:space="preserve"> </w:t>
+      </w:r>
+      <w:proofErr w:type="spellStart"/>
+      <w:r>
+        <w:t>torquent</w:t>
+      </w:r>
+      <w:proofErr w:type="spellEnd"/>
+      <w:r>
+        <w:t xml:space="preserve"> per </w:t>
+      </w:r>
+      <w:proofErr w:type="spellStart"/>
+      <w:r>
+        <w:t>conubia</w:t>
+      </w:r>
+      <w:proofErr w:type="spellEnd"/>
+      <w:r>
+        <w:t xml:space="preserve"> nostra </w:t>
+      </w:r>
+      <w:proofErr w:type="spellStart"/>
+      <w:r>
+        <w:t>inceptos</w:t>
+      </w:r>
+      <w:proofErr w:type="spellEnd"/>
+      <w:r>
+        <w:t xml:space="preserve"> </w:t>
+      </w:r>
+      <w:proofErr w:type="spellStart"/>
+      <w:r>
+        <w:t>himenaeos</w:t>
+      </w:r>
+      <w:proofErr w:type="spellEnd"/>
+      <w:r>
+        <w:t>.</w:t>
+      </w:r>
+    </w:p>
+    <w:p>
+      <w:pPr>
+        <w:pStyle w:val="Heading2"/>
+      </w:pPr>
+      <w:r>
+        <w:t>My method</w:t>
+      </w:r>
+    </w:p>
+    <w:p>
+      <w:pPr>
+        <w:keepNext/>
+      </w:pPr>
+      <w:r>
+        <w:t xml:space="preserve">Lorem ipsum dolor </w:t>
+      </w:r>
+      <w:proofErr w:type="gramStart"/>
+      <w:r>
+        <w:t>sit</w:t>
+      </w:r>
+      <w:proofErr w:type="gramEnd"/>
+      <w:r>
+        <w:t xml:space="preserve"> </w:t>
+      </w:r>
+      <w:proofErr w:type="spellStart"/>
+      <w:r>
+        <w:t>amet</w:t>
+      </w:r>
+      <w:proofErr w:type="spellEnd"/>
+      <w:r>
+        <w:t xml:space="preserve"> </w:t>
+      </w:r>
+      <w:proofErr w:type="spellStart"/>
+      <w:r>
+        <w:t>consectetur</w:t>
+      </w:r>
+      <w:proofErr w:type="spellEnd"/>
+      <w:r>
+        <w:t xml:space="preserve"> </w:t>
+      </w:r>
+      <w:proofErr w:type="spellStart"/>
+      <w:r>
+        <w:t>adipiscing</w:t>
+      </w:r>
+      <w:proofErr w:type="spellEnd"/>
+      <w:r>
+        <w:t xml:space="preserve"> </w:t>
+      </w:r>
+      <w:proofErr w:type="spellStart"/>
+      <w:r>
+        <w:t>elit</w:t>
+      </w:r>
+      <w:proofErr w:type="spellEnd"/>
+      <w:r>
+        <w:t xml:space="preserve">. </w:t>
+      </w:r>
+      <w:proofErr w:type="spellStart"/>
+      <w:r>
+        <w:t>Quisque</w:t>
+      </w:r>
+      <w:proofErr w:type="spellEnd"/>
+      <w:r>
+        <w:t xml:space="preserve"> </w:t>
+      </w:r>
+      <w:proofErr w:type="spellStart"/>
+      <w:r>
+        <w:t>faucibus</w:t>
+      </w:r>
+      <w:proofErr w:type="spellEnd"/>
+      <w:r>
+        <w:t xml:space="preserve"> ex </w:t>
+      </w:r>
+      <w:proofErr w:type="spellStart"/>
+      <w:r>
+        <w:t>sapien</w:t>
+      </w:r>
+      <w:proofErr w:type="spellEnd"/>
+      <w:r>
+        <w:t xml:space="preserve"> vitae </w:t>
+      </w:r>
+      <w:proofErr w:type="spellStart"/>
+      <w:r>
+        <w:t>pellentesque</w:t>
+      </w:r>
+      <w:proofErr w:type="spellEnd"/>
+      <w:r>
+        <w:t xml:space="preserve"> </w:t>
+      </w:r>
+      <w:proofErr w:type="spellStart"/>
+      <w:r>
+        <w:t>sem</w:t>
+      </w:r>
+      <w:proofErr w:type="spellEnd"/>
+      <w:r>
+        <w:t xml:space="preserve"> </w:t>
+      </w:r>
+      <w:proofErr w:type="spellStart"/>
+      <w:r>
+        <w:t>placerat</w:t>
+      </w:r>
+      <w:proofErr w:type="spellEnd"/>
+      <w:r>
+        <w:t xml:space="preserve">. In id cursus mi </w:t>
+      </w:r>
+      <w:proofErr w:type="spellStart"/>
+      <w:r>
+        <w:t>pretium</w:t>
+      </w:r>
+      <w:proofErr w:type="spellEnd"/>
+      <w:r>
+        <w:t xml:space="preserve"> </w:t>
+      </w:r>
+      <w:proofErr w:type="spellStart"/>
+      <w:r>
+        <w:t>tellus</w:t>
+      </w:r>
+      <w:proofErr w:type="spellEnd"/>
+      <w:r>
+        <w:t xml:space="preserve"> </w:t>
+      </w:r>
+      <w:proofErr w:type="spellStart"/>
+      <w:r>
+        <w:t>duis</w:t>
+      </w:r>
+      <w:proofErr w:type="spellEnd"/>
+      <w:r>
+        <w:t xml:space="preserve"> convallis. Tempus </w:t>
+      </w:r>
+      <w:proofErr w:type="spellStart"/>
+      <w:r>
+        <w:t>leo</w:t>
+      </w:r>
+      <w:proofErr w:type="spellEnd"/>
+      <w:r>
+        <w:t xml:space="preserve"> </w:t>
+      </w:r>
+      <w:proofErr w:type="spellStart"/>
+      <w:r>
+        <w:t>eu</w:t>
+      </w:r>
+      <w:proofErr w:type="spellEnd"/>
+      <w:r>
+        <w:t xml:space="preserve"> </w:t>
+      </w:r>
+      <w:proofErr w:type="spellStart"/>
+      <w:r>
+        <w:t>aenean</w:t>
+      </w:r>
+      <w:proofErr w:type="spellEnd"/>
+      <w:r>
+        <w:t xml:space="preserve"> sed diam </w:t>
+      </w:r>
+      <w:proofErr w:type="spellStart"/>
+      <w:r>
+        <w:t>urna</w:t>
+      </w:r>
+      <w:proofErr w:type="spellEnd"/>
+      <w:r>
+        <w:t xml:space="preserve"> </w:t>
+      </w:r>
+      <w:proofErr w:type="spellStart"/>
+      <w:r>
+        <w:t>tempor</w:t>
+      </w:r>
+      <w:proofErr w:type="spellEnd"/>
+      <w:r>
+        <w:t xml:space="preserve">. Pulvinar </w:t>
+      </w:r>
+      <w:proofErr w:type="spellStart"/>
+      <w:r>
+        <w:t>vivamus</w:t>
+      </w:r>
+      <w:proofErr w:type="spellEnd"/>
+      <w:r>
+        <w:t xml:space="preserve"> </w:t>
+      </w:r>
+      <w:proofErr w:type="spellStart"/>
+      <w:r>
+        <w:t>fringilla</w:t>
+      </w:r>
+      <w:proofErr w:type="spellEnd"/>
+      <w:r>
+        <w:t xml:space="preserve"> </w:t>
+      </w:r>
+      <w:proofErr w:type="spellStart"/>
+      <w:r>
+        <w:t>lacus</w:t>
+      </w:r>
+      <w:proofErr w:type="spellEnd"/>
+      <w:r>
+        <w:t xml:space="preserve"> nec </w:t>
+      </w:r>
+      <w:proofErr w:type="spellStart"/>
+      <w:r>
+        <w:t>metus</w:t>
+      </w:r>
+      <w:proofErr w:type="spellEnd"/>
+      <w:r>
+        <w:t xml:space="preserve"> </w:t>
+      </w:r>
+      <w:proofErr w:type="spellStart"/>
+      <w:r>
+        <w:t>bibendum</w:t>
+      </w:r>
+      <w:proofErr w:type="spellEnd"/>
+      <w:r>
+        <w:t xml:space="preserve"> </w:t>
+      </w:r>
+      <w:proofErr w:type="spellStart"/>
+      <w:r>
+        <w:t>egestas</w:t>
+      </w:r>
+      <w:proofErr w:type="spellEnd"/>
+      <w:r>
+        <w:t xml:space="preserve">. Iaculis </w:t>
+      </w:r>
+      <w:proofErr w:type="spellStart"/>
+      <w:r>
+        <w:t>massa</w:t>
+      </w:r>
+      <w:proofErr w:type="spellEnd"/>
+      <w:r>
+        <w:t xml:space="preserve"> </w:t>
+      </w:r>
+      <w:proofErr w:type="spellStart"/>
+      <w:r>
+        <w:t>nisl</w:t>
+      </w:r>
+      <w:proofErr w:type="spellEnd"/>
+      <w:r>
+        <w:t xml:space="preserve"> </w:t>
+      </w:r>
+      <w:proofErr w:type="spellStart"/>
+      <w:r>
+        <w:t>malesuada</w:t>
+      </w:r>
+      <w:proofErr w:type="spellEnd"/>
+      <w:r>
+        <w:t xml:space="preserve"> lacinia integer nunc </w:t>
+      </w:r>
+      <w:proofErr w:type="spellStart"/>
+      <w:r>
+        <w:t>posuere</w:t>
+      </w:r>
+      <w:proofErr w:type="spellEnd"/>
+      <w:r>
+        <w:t xml:space="preserve">. Ut </w:t>
+      </w:r>
+      <w:proofErr w:type="spellStart"/>
+      <w:r>
+        <w:t>hendrerit</w:t>
+      </w:r>
+      <w:proofErr w:type="spellEnd"/>
+      <w:r>
+        <w:t xml:space="preserve"> semper vel class </w:t>
+      </w:r>
+      <w:proofErr w:type="spellStart"/>
+      <w:r>
+        <w:t>aptent</w:t>
+      </w:r>
+      <w:proofErr w:type="spellEnd"/>
+      <w:r>
+        <w:t xml:space="preserve"> </w:t>
+      </w:r>
+      <w:proofErr w:type="spellStart"/>
+      <w:r>
+        <w:t>taciti</w:t>
+      </w:r>
+      <w:proofErr w:type="spellEnd"/>
+      <w:r>
+        <w:t xml:space="preserve"> </w:t>
+      </w:r>
+      <w:proofErr w:type="spellStart"/>
+      <w:r>
+        <w:t>sociosqu</w:t>
+      </w:r>
+      <w:proofErr w:type="spellEnd"/>
+      <w:r>
+        <w:t xml:space="preserve">. Ad </w:t>
+      </w:r>
+      <w:proofErr w:type="spellStart"/>
+      <w:r>
+        <w:t>litora</w:t>
+      </w:r>
+      <w:proofErr w:type="spellEnd"/>
+      <w:r>
+        <w:t xml:space="preserve"> </w:t>
+      </w:r>
+      <w:proofErr w:type="spellStart"/>
+      <w:r>
+        <w:t>torquent</w:t>
+      </w:r>
+      <w:proofErr w:type="spellEnd"/>
+      <w:r>
+        <w:t xml:space="preserve"> per </w:t>
+      </w:r>
+      <w:proofErr w:type="spellStart"/>
+      <w:r>
+        <w:t>conubia</w:t>
+      </w:r>
+      <w:proofErr w:type="spellEnd"/>
+      <w:r>
+        <w:t xml:space="preserve"> nostra </w:t>
+      </w:r>
+      <w:proofErr w:type="spellStart"/>
+      <w:r>
+        <w:t>inceptos</w:t>
+      </w:r>
+      <w:proofErr w:type="spellEnd"/>
+      <w:r>
+        <w:t xml:space="preserve"> </w:t>
+      </w:r>
+      <w:proofErr w:type="spellStart"/>
+      <w:r>
+        <w:t>himenaeos</w:t>
+      </w:r>
+      <w:proofErr w:type="spellEnd"/>
+      <w:r>
+        <w:t>.</w:t>
+      </w:r>
+    </w:p>
+    <w:p>
+      <w:pPr>
+        <w:pStyle w:val="Heading3"/>
+      </w:pPr>
+      <w:r>
+        <w:t>Sub section</w:t>
+      </w:r>
+    </w:p>
+    <w:p>
+      <w:pPr>
+        <w:keepNext/>
+      </w:pPr>
+      <w:r>
+        <w:t xml:space="preserve">Lorem ipsum dolor </w:t>
+      </w:r>
+      <w:proofErr w:type="gramStart"/>
+      <w:r>
+        <w:t>sit</w:t>
+      </w:r>
+      <w:proofErr w:type="gramEnd"/>
+      <w:r>
+        <w:t xml:space="preserve"> </w:t>
+      </w:r>
+      <w:proofErr w:type="spellStart"/>
+      <w:r>
+        <w:t>amet</w:t>
+      </w:r>
+      <w:proofErr w:type="spellEnd"/>
+      <w:r>
+        <w:t xml:space="preserve"> </w:t>
+      </w:r>
+      <w:proofErr w:type="spellStart"/>
+      <w:r>
+        <w:t>consectetur</w:t>
+      </w:r>
+      <w:proofErr w:type="spellEnd"/>
+      <w:r>
+        <w:t xml:space="preserve"> </w:t>
+      </w:r>
+      <w:proofErr w:type="spellStart"/>
+      <w:r>
+        <w:t>adipiscing</w:t>
+      </w:r>
+      <w:proofErr w:type="spellEnd"/>
+      <w:r>
+        <w:t xml:space="preserve"> </w:t>
+      </w:r>
+      <w:proofErr w:type="spellStart"/>
+      <w:r>
+        <w:t>elit</w:t>
+      </w:r>
+      <w:proofErr w:type="spellEnd"/>
+      <w:r>
+        <w:t xml:space="preserve">. </w:t>
+      </w:r>
+      <w:proofErr w:type="spellStart"/>
+      <w:r>
+        <w:t>Quisque</w:t>
+      </w:r>
+      <w:proofErr w:type="spellEnd"/>
+      <w:r>
+        <w:t xml:space="preserve"> </w:t>
+      </w:r>
+      <w:proofErr w:type="spellStart"/>
+      <w:r>
+        <w:t>faucibus</w:t>
+      </w:r>
+      <w:proofErr w:type="spellEnd"/>
+      <w:r>
+        <w:t xml:space="preserve"> ex </w:t>
+      </w:r>
+      <w:proofErr w:type="spellStart"/>
+      <w:r>
+        <w:t>sapien</w:t>
+      </w:r>
+      <w:proofErr w:type="spellEnd"/>
+      <w:r>
+        <w:t xml:space="preserve"> vitae </w:t>
+      </w:r>
+      <w:proofErr w:type="spellStart"/>
+      <w:r>
+        <w:t>pellentesque</w:t>
+      </w:r>
+      <w:proofErr w:type="spellEnd"/>
+      <w:r>
+        <w:t xml:space="preserve"> </w:t>
+      </w:r>
+      <w:proofErr w:type="spellStart"/>
+      <w:r>
+        <w:t>sem</w:t>
+      </w:r>
+      <w:proofErr w:type="spellEnd"/>
+      <w:r>
+        <w:t xml:space="preserve"> </w:t>
+      </w:r>
+      <w:proofErr w:type="spellStart"/>
+      <w:r>
+        <w:t>placerat</w:t>
+      </w:r>
+      <w:proofErr w:type="spellEnd"/>
+      <w:r>
+        <w:t xml:space="preserve">. In id cursus mi </w:t>
+      </w:r>
+      <w:proofErr w:type="spellStart"/>
+      <w:r>
+        <w:t>pretium</w:t>
+      </w:r>
+      <w:proofErr w:type="spellEnd"/>
+      <w:r>
+        <w:t xml:space="preserve"> </w:t>
+      </w:r>
+      <w:proofErr w:type="spellStart"/>
+      <w:r>
+        <w:t>tellus</w:t>
+      </w:r>
+      <w:proofErr w:type="spellEnd"/>
+      <w:r>
+        <w:t xml:space="preserve"> </w:t>
+      </w:r>
+      <w:proofErr w:type="spellStart"/>
+      <w:r>
+        <w:t>duis</w:t>
+      </w:r>
+      <w:proofErr w:type="spellEnd"/>
+      <w:r>
+        <w:t xml:space="preserve"> convallis. Tempus </w:t>
+      </w:r>
+      <w:proofErr w:type="spellStart"/>
+      <w:r>
+        <w:t>leo</w:t>
+      </w:r>
+      <w:proofErr w:type="spellEnd"/>
+      <w:r>
+        <w:t xml:space="preserve"> </w:t>
+      </w:r>
+      <w:proofErr w:type="spellStart"/>
+      <w:r>
+        <w:t>eu</w:t>
+      </w:r>
+      <w:proofErr w:type="spellEnd"/>
+      <w:r>
+        <w:t xml:space="preserve"> </w:t>
+      </w:r>
+      <w:proofErr w:type="spellStart"/>
+      <w:r>
+        <w:t>aenean</w:t>
+      </w:r>
+      <w:proofErr w:type="spellEnd"/>
+      <w:r>
+        <w:t xml:space="preserve"> sed diam </w:t>
+      </w:r>
+      <w:proofErr w:type="spellStart"/>
+      <w:r>
+        <w:t>urna</w:t>
+      </w:r>
+      <w:proofErr w:type="spellEnd"/>
+      <w:r>
+        <w:t xml:space="preserve"> </w:t>
+      </w:r>
+      <w:proofErr w:type="spellStart"/>
+      <w:r>
+        <w:t>tempor</w:t>
+      </w:r>
+      <w:proofErr w:type="spellEnd"/>
+      <w:r>
+        <w:t xml:space="preserve">. Pulvinar </w:t>
+      </w:r>
+      <w:proofErr w:type="spellStart"/>
+      <w:r>
+        <w:t>vivamus</w:t>
+      </w:r>
+      <w:proofErr w:type="spellEnd"/>
+      <w:r>
+        <w:t xml:space="preserve"> </w:t>
+      </w:r>
+      <w:proofErr w:type="spellStart"/>
+      <w:r>
+        <w:t>fringilla</w:t>
+      </w:r>
+      <w:proofErr w:type="spellEnd"/>
+      <w:r>
+        <w:t xml:space="preserve"> </w:t>
+      </w:r>
+      <w:proofErr w:type="spellStart"/>
+      <w:r>
+        <w:t>lacus</w:t>
+      </w:r>
+      <w:proofErr w:type="spellEnd"/>
+      <w:r>
+        <w:t xml:space="preserve"> nec </w:t>
+      </w:r>
+      <w:proofErr w:type="spellStart"/>
+      <w:r>
+        <w:t>metus</w:t>
+      </w:r>
+      <w:proofErr w:type="spellEnd"/>
+      <w:r>
+        <w:t xml:space="preserve"> </w:t>
+      </w:r>
+      <w:proofErr w:type="spellStart"/>
+      <w:r>
+        <w:t>bibendum</w:t>
+      </w:r>
+      <w:proofErr w:type="spellEnd"/>
+      <w:r>
+        <w:t xml:space="preserve"> </w:t>
+      </w:r>
+      <w:proofErr w:type="spellStart"/>
+      <w:r>
+        <w:t>egestas</w:t>
+      </w:r>
+      <w:proofErr w:type="spellEnd"/>
+      <w:r>
+        <w:t xml:space="preserve">. Iaculis </w:t>
+      </w:r>
+      <w:proofErr w:type="spellStart"/>
+      <w:r>
+        <w:t>massa</w:t>
+      </w:r>
+      <w:proofErr w:type="spellEnd"/>
+      <w:r>
+        <w:t xml:space="preserve"> </w:t>
+      </w:r>
+      <w:proofErr w:type="spellStart"/>
+      <w:r>
+        <w:t>nisl</w:t>
+      </w:r>
+      <w:proofErr w:type="spellEnd"/>
+      <w:r>
+        <w:t xml:space="preserve"> </w:t>
+      </w:r>
+      <w:proofErr w:type="spellStart"/>
+      <w:r>
+        <w:t>malesuada</w:t>
+      </w:r>
+      <w:proofErr w:type="spellEnd"/>
+      <w:r>
+        <w:t xml:space="preserve"> lacinia integer nunc </w:t>
+      </w:r>
+      <w:proofErr w:type="spellStart"/>
+      <w:r>
+        <w:t>posuere</w:t>
+      </w:r>
+      <w:proofErr w:type="spellEnd"/>
+      <w:r>
+        <w:t xml:space="preserve">. Ut </w:t>
+      </w:r>
+      <w:proofErr w:type="spellStart"/>
+      <w:r>
+        <w:t>hendrerit</w:t>
+      </w:r>
+      <w:proofErr w:type="spellEnd"/>
+      <w:r>
+        <w:t xml:space="preserve"> semper vel class </w:t>
+      </w:r>
+      <w:proofErr w:type="spellStart"/>
+      <w:r>
+        <w:t>aptent</w:t>
+      </w:r>
+      <w:proofErr w:type="spellEnd"/>
+      <w:r>
+        <w:t xml:space="preserve"> </w:t>
+      </w:r>
+      <w:proofErr w:type="spellStart"/>
+      <w:r>
+        <w:t>taciti</w:t>
+      </w:r>
+      <w:proofErr w:type="spellEnd"/>
+      <w:r>
+        <w:t xml:space="preserve"> </w:t>
+      </w:r>
+      <w:proofErr w:type="spellStart"/>
       <w:r>
         <w:lastRenderedPageBreak/>
-        <w:t xml:space="preserve">Pearson correlation and mapped themes to quantitative constructs via a predefined codebook. </w:t>
+        <w:t>sociosqu</w:t>
+      </w:r>
+      <w:proofErr w:type="spellEnd"/>
+      <w:r>
+        <w:t xml:space="preserve">. Ad </w:t>
+      </w:r>
+      <w:proofErr w:type="spellStart"/>
+      <w:r>
+        <w:t>litora</w:t>
+      </w:r>
+      <w:proofErr w:type="spellEnd"/>
+      <w:r>
+        <w:t xml:space="preserve"> </w:t>
+      </w:r>
+      <w:proofErr w:type="spellStart"/>
+      <w:r>
+        <w:t>torquent</w:t>
+      </w:r>
+      <w:proofErr w:type="spellEnd"/>
+      <w:r>
+        <w:t xml:space="preserve"> per </w:t>
+      </w:r>
+      <w:proofErr w:type="spellStart"/>
+      <w:r>
+        <w:t>conubia</w:t>
+      </w:r>
+      <w:proofErr w:type="spellEnd"/>
+      <w:r>
+        <w:t xml:space="preserve"> nostra </w:t>
+      </w:r>
+      <w:proofErr w:type="spellStart"/>
+      <w:r>
+        <w:t>inceptos</w:t>
+      </w:r>
+      <w:proofErr w:type="spellEnd"/>
+      <w:r>
+        <w:t xml:space="preserve"> </w:t>
+      </w:r>
+      <w:proofErr w:type="spellStart"/>
+      <w:r>
+        <w:t>himenaeos</w:t>
+      </w:r>
+      <w:proofErr w:type="spellEnd"/>
+      <w:r>
+        <w:t>.</w:t>
       </w:r>
       <w:r>
         <w:rPr>
@@ -352,27 +2197,14 @@
       <w:r>
         <w:t xml:space="preserve">Figure </w:t>
       </w:r>
-      <w:r>
-        <w:fldChar w:fldCharType="begin"/>
-      </w:r>
-      <w:r>
-        <w:instrText xml:space="preserve"> SEQ Figure \* ARABIC </w:instrText>
-      </w:r>
-      <w:r>
-        <w:fldChar w:fldCharType="separate"/>
-      </w:r>
-      <w:r>
-        <w:rPr>
-          <w:noProof/>
-        </w:rPr>
-        <w:t>1</w:t>
-      </w:r>
-      <w:r>
-        <w:rPr>
-          <w:noProof/>
-        </w:rPr>
-        <w:fldChar w:fldCharType="end"/>
-      </w:r>
+      <w:fldSimple w:instr=" SEQ Figure \* ARABIC ">
+        <w:r>
+          <w:rPr>
+            <w:noProof/>
+          </w:rPr>
+          <w:t>1</w:t>
+        </w:r>
+      </w:fldSimple>
       <w:r>
         <w:t>: CRISP-T python package</w:t>
       </w:r>
@@ -413,10 +2245,632 @@
     </w:p>
     <w:p>
       <w:r>
-        <w:t>3.1 Descriptive Statistics: Mean Likert scores ranged from 3.4 to 4.1 (SD 0.7–0.9). Interview excerpts averaged 120 words (SD 38). 3.2 Topic–Scale Associations: The “Usability” topic prevalence correlated with the usability scale (r=0.42, p&lt;0.01). Access-related themes showed weaker associations (r=0.18, ns). 3.3 Sentiment: Overall polarity skewed positive (mean 0.21), aligning with higher trust scores. 3.4 Concordance: Cross-modal agreement reached 78% when mapping themes to constructs via the codebook; disagreements clustered around ambiguous excerpts</w:t>
-      </w:r>
-      <w:r>
-        <w:t xml:space="preserve"> \cite{Eapen2026}</w:t>
+        <w:t xml:space="preserve">Lorem ipsum dolor </w:t>
+      </w:r>
+      <w:proofErr w:type="gramStart"/>
+      <w:r>
+        <w:t>sit</w:t>
+      </w:r>
+      <w:proofErr w:type="gramEnd"/>
+      <w:r>
+        <w:t xml:space="preserve"> </w:t>
+      </w:r>
+      <w:proofErr w:type="spellStart"/>
+      <w:r>
+        <w:t>amet</w:t>
+      </w:r>
+      <w:proofErr w:type="spellEnd"/>
+      <w:r>
+        <w:t xml:space="preserve"> </w:t>
+      </w:r>
+      <w:proofErr w:type="spellStart"/>
+      <w:r>
+        <w:t>consectetur</w:t>
+      </w:r>
+      <w:proofErr w:type="spellEnd"/>
+      <w:r>
+        <w:t xml:space="preserve"> </w:t>
+      </w:r>
+      <w:proofErr w:type="spellStart"/>
+      <w:r>
+        <w:t>adipiscing</w:t>
+      </w:r>
+      <w:proofErr w:type="spellEnd"/>
+      <w:r>
+        <w:t xml:space="preserve"> </w:t>
+      </w:r>
+      <w:proofErr w:type="spellStart"/>
+      <w:r>
+        <w:t>elit</w:t>
+      </w:r>
+      <w:proofErr w:type="spellEnd"/>
+      <w:r>
+        <w:t xml:space="preserve">. </w:t>
+      </w:r>
+      <w:proofErr w:type="spellStart"/>
+      <w:r>
+        <w:t>Quisque</w:t>
+      </w:r>
+      <w:proofErr w:type="spellEnd"/>
+      <w:r>
+        <w:t xml:space="preserve"> </w:t>
+      </w:r>
+      <w:proofErr w:type="spellStart"/>
+      <w:r>
+        <w:t>faucibus</w:t>
+      </w:r>
+      <w:proofErr w:type="spellEnd"/>
+      <w:r>
+        <w:t xml:space="preserve"> ex </w:t>
+      </w:r>
+      <w:proofErr w:type="spellStart"/>
+      <w:r>
+        <w:t>sapien</w:t>
+      </w:r>
+      <w:proofErr w:type="spellEnd"/>
+      <w:r>
+        <w:t xml:space="preserve"> vitae </w:t>
+      </w:r>
+      <w:proofErr w:type="spellStart"/>
+      <w:r>
+        <w:t>pellentesque</w:t>
+      </w:r>
+      <w:proofErr w:type="spellEnd"/>
+      <w:r>
+        <w:t xml:space="preserve"> </w:t>
+      </w:r>
+      <w:proofErr w:type="spellStart"/>
+      <w:r>
+        <w:t>sem</w:t>
+      </w:r>
+      <w:proofErr w:type="spellEnd"/>
+      <w:r>
+        <w:t xml:space="preserve"> </w:t>
+      </w:r>
+      <w:proofErr w:type="spellStart"/>
+      <w:r>
+        <w:t>placerat</w:t>
+      </w:r>
+      <w:proofErr w:type="spellEnd"/>
+      <w:r>
+        <w:t xml:space="preserve">. In id cursus mi </w:t>
+      </w:r>
+      <w:proofErr w:type="spellStart"/>
+      <w:r>
+        <w:t>pretium</w:t>
+      </w:r>
+      <w:proofErr w:type="spellEnd"/>
+      <w:r>
+        <w:t xml:space="preserve"> </w:t>
+      </w:r>
+      <w:proofErr w:type="spellStart"/>
+      <w:r>
+        <w:t>tellus</w:t>
+      </w:r>
+      <w:proofErr w:type="spellEnd"/>
+      <w:r>
+        <w:t xml:space="preserve"> </w:t>
+      </w:r>
+      <w:proofErr w:type="spellStart"/>
+      <w:r>
+        <w:t>duis</w:t>
+      </w:r>
+      <w:proofErr w:type="spellEnd"/>
+      <w:r>
+        <w:t xml:space="preserve"> convallis. Tempus </w:t>
+      </w:r>
+      <w:proofErr w:type="spellStart"/>
+      <w:r>
+        <w:t>leo</w:t>
+      </w:r>
+      <w:proofErr w:type="spellEnd"/>
+      <w:r>
+        <w:t xml:space="preserve"> </w:t>
+      </w:r>
+      <w:proofErr w:type="spellStart"/>
+      <w:r>
+        <w:t>eu</w:t>
+      </w:r>
+      <w:proofErr w:type="spellEnd"/>
+      <w:r>
+        <w:t xml:space="preserve"> </w:t>
+      </w:r>
+      <w:proofErr w:type="spellStart"/>
+      <w:r>
+        <w:t>aenean</w:t>
+      </w:r>
+      <w:proofErr w:type="spellEnd"/>
+      <w:r>
+        <w:t xml:space="preserve"> sed diam </w:t>
+      </w:r>
+      <w:proofErr w:type="spellStart"/>
+      <w:r>
+        <w:t>urna</w:t>
+      </w:r>
+      <w:proofErr w:type="spellEnd"/>
+      <w:r>
+        <w:t xml:space="preserve"> </w:t>
+      </w:r>
+      <w:proofErr w:type="spellStart"/>
+      <w:r>
+        <w:t>tempor</w:t>
+      </w:r>
+      <w:proofErr w:type="spellEnd"/>
+      <w:r>
+        <w:t xml:space="preserve">. Pulvinar </w:t>
+      </w:r>
+      <w:proofErr w:type="spellStart"/>
+      <w:r>
+        <w:t>vivamus</w:t>
+      </w:r>
+      <w:proofErr w:type="spellEnd"/>
+      <w:r>
+        <w:t xml:space="preserve"> </w:t>
+      </w:r>
+      <w:proofErr w:type="spellStart"/>
+      <w:r>
+        <w:t>fringilla</w:t>
+      </w:r>
+      <w:proofErr w:type="spellEnd"/>
+      <w:r>
+        <w:t xml:space="preserve"> </w:t>
+      </w:r>
+      <w:proofErr w:type="spellStart"/>
+      <w:r>
+        <w:t>lacus</w:t>
+      </w:r>
+      <w:proofErr w:type="spellEnd"/>
+      <w:r>
+        <w:t xml:space="preserve"> nec </w:t>
+      </w:r>
+      <w:proofErr w:type="spellStart"/>
+      <w:r>
+        <w:t>metus</w:t>
+      </w:r>
+      <w:proofErr w:type="spellEnd"/>
+      <w:r>
+        <w:t xml:space="preserve"> </w:t>
+      </w:r>
+      <w:proofErr w:type="spellStart"/>
+      <w:r>
+        <w:t>bibendum</w:t>
+      </w:r>
+      <w:proofErr w:type="spellEnd"/>
+      <w:r>
+        <w:t xml:space="preserve"> </w:t>
+      </w:r>
+      <w:proofErr w:type="spellStart"/>
+      <w:r>
+        <w:t>egestas</w:t>
+      </w:r>
+      <w:proofErr w:type="spellEnd"/>
+      <w:r>
+        <w:t xml:space="preserve">. Iaculis </w:t>
+      </w:r>
+      <w:proofErr w:type="spellStart"/>
+      <w:r>
+        <w:t>massa</w:t>
+      </w:r>
+      <w:proofErr w:type="spellEnd"/>
+      <w:r>
+        <w:t xml:space="preserve"> </w:t>
+      </w:r>
+      <w:proofErr w:type="spellStart"/>
+      <w:r>
+        <w:t>nisl</w:t>
+      </w:r>
+      <w:proofErr w:type="spellEnd"/>
+      <w:r>
+        <w:t xml:space="preserve"> </w:t>
+      </w:r>
+      <w:proofErr w:type="spellStart"/>
+      <w:r>
+        <w:t>malesuada</w:t>
+      </w:r>
+      <w:proofErr w:type="spellEnd"/>
+      <w:r>
+        <w:t xml:space="preserve"> lacinia integer nunc </w:t>
+      </w:r>
+      <w:proofErr w:type="spellStart"/>
+      <w:r>
+        <w:t>posuere</w:t>
+      </w:r>
+      <w:proofErr w:type="spellEnd"/>
+      <w:r>
+        <w:t xml:space="preserve">. Ut </w:t>
+      </w:r>
+      <w:proofErr w:type="spellStart"/>
+      <w:r>
+        <w:t>hendrerit</w:t>
+      </w:r>
+      <w:proofErr w:type="spellEnd"/>
+      <w:r>
+        <w:t xml:space="preserve"> semper vel class </w:t>
+      </w:r>
+      <w:proofErr w:type="spellStart"/>
+      <w:r>
+        <w:t>aptent</w:t>
+      </w:r>
+      <w:proofErr w:type="spellEnd"/>
+      <w:r>
+        <w:t xml:space="preserve"> </w:t>
+      </w:r>
+      <w:proofErr w:type="spellStart"/>
+      <w:r>
+        <w:t>taciti</w:t>
+      </w:r>
+      <w:proofErr w:type="spellEnd"/>
+      <w:r>
+        <w:t xml:space="preserve"> </w:t>
+      </w:r>
+      <w:proofErr w:type="spellStart"/>
+      <w:r>
+        <w:t>sociosqu</w:t>
+      </w:r>
+      <w:proofErr w:type="spellEnd"/>
+      <w:r>
+        <w:t xml:space="preserve">. Ad </w:t>
+      </w:r>
+      <w:proofErr w:type="spellStart"/>
+      <w:r>
+        <w:t>litora</w:t>
+      </w:r>
+      <w:proofErr w:type="spellEnd"/>
+      <w:r>
+        <w:t xml:space="preserve"> </w:t>
+      </w:r>
+      <w:proofErr w:type="spellStart"/>
+      <w:r>
+        <w:t>torquent</w:t>
+      </w:r>
+      <w:proofErr w:type="spellEnd"/>
+      <w:r>
+        <w:t xml:space="preserve"> per </w:t>
+      </w:r>
+      <w:proofErr w:type="spellStart"/>
+      <w:r>
+        <w:t>conubia</w:t>
+      </w:r>
+      <w:proofErr w:type="spellEnd"/>
+      <w:r>
+        <w:t xml:space="preserve"> nostra </w:t>
+      </w:r>
+      <w:proofErr w:type="spellStart"/>
+      <w:r>
+        <w:t>inceptos</w:t>
+      </w:r>
+      <w:proofErr w:type="spellEnd"/>
+      <w:r>
+        <w:t xml:space="preserve"> </w:t>
+      </w:r>
+      <w:proofErr w:type="spellStart"/>
+      <w:r>
+        <w:t>himenaeos</w:t>
+      </w:r>
+      <w:proofErr w:type="spellEnd"/>
+      <w:r>
+        <w:t>.</w:t>
+      </w:r>
+    </w:p>
+    <w:p/>
+    <w:p>
+      <w:r>
+        <w:t xml:space="preserve">Lorem ipsum dolor </w:t>
+      </w:r>
+      <w:proofErr w:type="gramStart"/>
+      <w:r>
+        <w:t>sit</w:t>
+      </w:r>
+      <w:proofErr w:type="gramEnd"/>
+      <w:r>
+        <w:t xml:space="preserve"> </w:t>
+      </w:r>
+      <w:proofErr w:type="spellStart"/>
+      <w:r>
+        <w:t>amet</w:t>
+      </w:r>
+      <w:proofErr w:type="spellEnd"/>
+      <w:r>
+        <w:t xml:space="preserve"> </w:t>
+      </w:r>
+      <w:proofErr w:type="spellStart"/>
+      <w:r>
+        <w:t>consectetur</w:t>
+      </w:r>
+      <w:proofErr w:type="spellEnd"/>
+      <w:r>
+        <w:t xml:space="preserve"> </w:t>
+      </w:r>
+      <w:proofErr w:type="spellStart"/>
+      <w:r>
+        <w:t>adipiscing</w:t>
+      </w:r>
+      <w:proofErr w:type="spellEnd"/>
+      <w:r>
+        <w:t xml:space="preserve"> </w:t>
+      </w:r>
+      <w:proofErr w:type="spellStart"/>
+      <w:r>
+        <w:t>elit</w:t>
+      </w:r>
+      <w:proofErr w:type="spellEnd"/>
+      <w:r>
+        <w:t xml:space="preserve">. </w:t>
+      </w:r>
+      <w:proofErr w:type="spellStart"/>
+      <w:r>
+        <w:t>Quisque</w:t>
+      </w:r>
+      <w:proofErr w:type="spellEnd"/>
+      <w:r>
+        <w:t xml:space="preserve"> </w:t>
+      </w:r>
+      <w:proofErr w:type="spellStart"/>
+      <w:r>
+        <w:t>faucibus</w:t>
+      </w:r>
+      <w:proofErr w:type="spellEnd"/>
+      <w:r>
+        <w:t xml:space="preserve"> ex </w:t>
+      </w:r>
+      <w:proofErr w:type="spellStart"/>
+      <w:r>
+        <w:t>sapien</w:t>
+      </w:r>
+      <w:proofErr w:type="spellEnd"/>
+      <w:r>
+        <w:t xml:space="preserve"> vitae </w:t>
+      </w:r>
+      <w:proofErr w:type="spellStart"/>
+      <w:r>
+        <w:t>pellentesque</w:t>
+      </w:r>
+      <w:proofErr w:type="spellEnd"/>
+      <w:r>
+        <w:t xml:space="preserve"> </w:t>
+      </w:r>
+      <w:proofErr w:type="spellStart"/>
+      <w:r>
+        <w:t>sem</w:t>
+      </w:r>
+      <w:proofErr w:type="spellEnd"/>
+      <w:r>
+        <w:t xml:space="preserve"> </w:t>
+      </w:r>
+      <w:proofErr w:type="spellStart"/>
+      <w:r>
+        <w:t>placerat</w:t>
+      </w:r>
+      <w:proofErr w:type="spellEnd"/>
+      <w:r>
+        <w:t xml:space="preserve">. In id cursus mi </w:t>
+      </w:r>
+      <w:proofErr w:type="spellStart"/>
+      <w:r>
+        <w:t>pretium</w:t>
+      </w:r>
+      <w:proofErr w:type="spellEnd"/>
+      <w:r>
+        <w:t xml:space="preserve"> </w:t>
+      </w:r>
+      <w:proofErr w:type="spellStart"/>
+      <w:r>
+        <w:t>tellus</w:t>
+      </w:r>
+      <w:proofErr w:type="spellEnd"/>
+      <w:r>
+        <w:t xml:space="preserve"> </w:t>
+      </w:r>
+      <w:proofErr w:type="spellStart"/>
+      <w:r>
+        <w:t>duis</w:t>
+      </w:r>
+      <w:proofErr w:type="spellEnd"/>
+      <w:r>
+        <w:t xml:space="preserve"> convallis. Tempus </w:t>
+      </w:r>
+      <w:proofErr w:type="spellStart"/>
+      <w:r>
+        <w:t>leo</w:t>
+      </w:r>
+      <w:proofErr w:type="spellEnd"/>
+      <w:r>
+        <w:t xml:space="preserve"> </w:t>
+      </w:r>
+      <w:proofErr w:type="spellStart"/>
+      <w:r>
+        <w:t>eu</w:t>
+      </w:r>
+      <w:proofErr w:type="spellEnd"/>
+      <w:r>
+        <w:t xml:space="preserve"> </w:t>
+      </w:r>
+      <w:proofErr w:type="spellStart"/>
+      <w:r>
+        <w:t>aenean</w:t>
+      </w:r>
+      <w:proofErr w:type="spellEnd"/>
+      <w:r>
+        <w:t xml:space="preserve"> sed diam </w:t>
+      </w:r>
+      <w:proofErr w:type="spellStart"/>
+      <w:r>
+        <w:t>urna</w:t>
+      </w:r>
+      <w:proofErr w:type="spellEnd"/>
+      <w:r>
+        <w:t xml:space="preserve"> </w:t>
+      </w:r>
+      <w:proofErr w:type="spellStart"/>
+      <w:r>
+        <w:t>tempor</w:t>
+      </w:r>
+      <w:proofErr w:type="spellEnd"/>
+      <w:r>
+        <w:t xml:space="preserve">. Pulvinar </w:t>
+      </w:r>
+      <w:proofErr w:type="spellStart"/>
+      <w:r>
+        <w:t>vivamus</w:t>
+      </w:r>
+      <w:proofErr w:type="spellEnd"/>
+      <w:r>
+        <w:t xml:space="preserve"> </w:t>
+      </w:r>
+      <w:proofErr w:type="spellStart"/>
+      <w:r>
+        <w:t>fringilla</w:t>
+      </w:r>
+      <w:proofErr w:type="spellEnd"/>
+      <w:r>
+        <w:t xml:space="preserve"> </w:t>
+      </w:r>
+      <w:proofErr w:type="spellStart"/>
+      <w:r>
+        <w:t>lacus</w:t>
+      </w:r>
+      <w:proofErr w:type="spellEnd"/>
+      <w:r>
+        <w:t xml:space="preserve"> nec </w:t>
+      </w:r>
+      <w:proofErr w:type="spellStart"/>
+      <w:r>
+        <w:t>metus</w:t>
+      </w:r>
+      <w:proofErr w:type="spellEnd"/>
+      <w:r>
+        <w:t xml:space="preserve"> </w:t>
+      </w:r>
+      <w:proofErr w:type="spellStart"/>
+      <w:r>
+        <w:t>bibendum</w:t>
+      </w:r>
+      <w:proofErr w:type="spellEnd"/>
+      <w:r>
+        <w:t xml:space="preserve"> </w:t>
+      </w:r>
+      <w:proofErr w:type="spellStart"/>
+      <w:r>
+        <w:t>egestas</w:t>
+      </w:r>
+      <w:proofErr w:type="spellEnd"/>
+      <w:r>
+        <w:t xml:space="preserve">. Iaculis </w:t>
+      </w:r>
+      <w:proofErr w:type="spellStart"/>
+      <w:r>
+        <w:t>massa</w:t>
+      </w:r>
+      <w:proofErr w:type="spellEnd"/>
+      <w:r>
+        <w:t xml:space="preserve"> </w:t>
+      </w:r>
+      <w:proofErr w:type="spellStart"/>
+      <w:r>
+        <w:t>nisl</w:t>
+      </w:r>
+      <w:proofErr w:type="spellEnd"/>
+      <w:r>
+        <w:t xml:space="preserve"> </w:t>
+      </w:r>
+      <w:proofErr w:type="spellStart"/>
+      <w:r>
+        <w:t>malesuada</w:t>
+      </w:r>
+      <w:proofErr w:type="spellEnd"/>
+      <w:r>
+        <w:t xml:space="preserve"> lacinia integer nunc </w:t>
+      </w:r>
+      <w:proofErr w:type="spellStart"/>
+      <w:r>
+        <w:t>posuere</w:t>
+      </w:r>
+      <w:proofErr w:type="spellEnd"/>
+      <w:r>
+        <w:t xml:space="preserve">. Ut </w:t>
+      </w:r>
+      <w:proofErr w:type="spellStart"/>
+      <w:r>
+        <w:t>hendrerit</w:t>
+      </w:r>
+      <w:proofErr w:type="spellEnd"/>
+      <w:r>
+        <w:t xml:space="preserve"> semper vel class </w:t>
+      </w:r>
+      <w:proofErr w:type="spellStart"/>
+      <w:r>
+        <w:t>aptent</w:t>
+      </w:r>
+      <w:proofErr w:type="spellEnd"/>
+      <w:r>
+        <w:t xml:space="preserve"> </w:t>
+      </w:r>
+      <w:proofErr w:type="spellStart"/>
+      <w:r>
+        <w:t>taciti</w:t>
+      </w:r>
+      <w:proofErr w:type="spellEnd"/>
+      <w:r>
+        <w:t xml:space="preserve"> </w:t>
+      </w:r>
+      <w:proofErr w:type="spellStart"/>
+      <w:r>
+        <w:t>sociosqu</w:t>
+      </w:r>
+      <w:proofErr w:type="spellEnd"/>
+      <w:r>
+        <w:t xml:space="preserve">. Ad </w:t>
+      </w:r>
+      <w:proofErr w:type="spellStart"/>
+      <w:r>
+        <w:t>litora</w:t>
+      </w:r>
+      <w:proofErr w:type="spellEnd"/>
+      <w:r>
+        <w:t xml:space="preserve"> </w:t>
+      </w:r>
+      <w:proofErr w:type="spellStart"/>
+      <w:r>
+        <w:t>torquent</w:t>
+      </w:r>
+      <w:proofErr w:type="spellEnd"/>
+      <w:r>
+        <w:t xml:space="preserve"> per </w:t>
+      </w:r>
+      <w:proofErr w:type="spellStart"/>
+      <w:r>
+        <w:t>conubia</w:t>
+      </w:r>
+      <w:proofErr w:type="spellEnd"/>
+      <w:r>
+        <w:t xml:space="preserve"> nostra </w:t>
+      </w:r>
+      <w:proofErr w:type="spellStart"/>
+      <w:r>
+        <w:t>inceptos</w:t>
+      </w:r>
+      <w:proofErr w:type="spellEnd"/>
+      <w:r>
+        <w:t xml:space="preserve"> </w:t>
+      </w:r>
+      <w:proofErr w:type="spellStart"/>
+      <w:r>
+        <w:t>himenaeos</w:t>
+      </w:r>
+      <w:proofErr w:type="spellEnd"/>
+      <w:r>
+        <w:t>.</w:t>
+      </w:r>
+      <w:r>
+        <w:t>\</w:t>
+      </w:r>
+      <w:proofErr w:type="gramStart"/>
+      <w:r>
+        <w:t>cite{</w:t>
+      </w:r>
+      <w:proofErr w:type="gramEnd"/>
+      <w:r>
+        <w:t>Eapen2026}</w:t>
       </w:r>
       <w:r>
         <w:t>.</w:t>
@@ -428,6 +2882,7 @@
         <w:pStyle w:val="Heading1"/>
       </w:pPr>
       <w:r>
+        <w:lastRenderedPageBreak/>
         <w:t>Table 1. Summary of Survey Scales</w:t>
       </w:r>
     </w:p>
@@ -533,7 +2988,6 @@
           </w:tcPr>
           <w:p>
             <w:r>
-              <w:lastRenderedPageBreak/>
               <w:t>Usability</w:t>
             </w:r>
           </w:p>
@@ -622,27 +3076,14 @@
       <w:r>
         <w:t xml:space="preserve">Figure </w:t>
       </w:r>
-      <w:r>
-        <w:fldChar w:fldCharType="begin"/>
-      </w:r>
-      <w:r>
-        <w:instrText xml:space="preserve"> SEQ Figure \* ARABIC </w:instrText>
-      </w:r>
-      <w:r>
-        <w:fldChar w:fldCharType="separate"/>
-      </w:r>
-      <w:r>
-        <w:rPr>
-          <w:noProof/>
-        </w:rPr>
-        <w:t>2</w:t>
-      </w:r>
-      <w:r>
-        <w:rPr>
-          <w:noProof/>
-        </w:rPr>
-        <w:fldChar w:fldCharType="end"/>
-      </w:r>
+      <w:fldSimple w:instr=" SEQ Figure \* ARABIC ">
+        <w:r>
+          <w:rPr>
+            <w:noProof/>
+          </w:rPr>
+          <w:t>2</w:t>
+        </w:r>
+      </w:fldSimple>
       <w:r>
         <w:t>: Summary of results</w:t>
       </w:r>
@@ -683,7 +3124,621 @@
     </w:p>
     <w:p>
       <w:r>
-        <w:t>This demonstration highlights how computational triangulation can strengthen interpretive validity by cross-checking qualitative themes against quantitative indicators. The moderate correlation between usability topics and scale scores suggests construct alignment, while weaker access associations emphasize contextual factors not captured by simple scales. Limitations include synthetic data, small qualitative sample size, and reliance on lexicon-based sentiment. Future work should test transformer-based encoders and multi-label coding with inter-rater reliability.</w:t>
+        <w:t xml:space="preserve">Lorem ipsum dolor </w:t>
+      </w:r>
+      <w:proofErr w:type="gramStart"/>
+      <w:r>
+        <w:t>sit</w:t>
+      </w:r>
+      <w:proofErr w:type="gramEnd"/>
+      <w:r>
+        <w:t xml:space="preserve"> </w:t>
+      </w:r>
+      <w:proofErr w:type="spellStart"/>
+      <w:r>
+        <w:t>amet</w:t>
+      </w:r>
+      <w:proofErr w:type="spellEnd"/>
+      <w:r>
+        <w:t xml:space="preserve"> </w:t>
+      </w:r>
+      <w:proofErr w:type="spellStart"/>
+      <w:r>
+        <w:t>consectetur</w:t>
+      </w:r>
+      <w:proofErr w:type="spellEnd"/>
+      <w:r>
+        <w:t xml:space="preserve"> </w:t>
+      </w:r>
+      <w:proofErr w:type="spellStart"/>
+      <w:r>
+        <w:t>adipiscing</w:t>
+      </w:r>
+      <w:proofErr w:type="spellEnd"/>
+      <w:r>
+        <w:t xml:space="preserve"> </w:t>
+      </w:r>
+      <w:proofErr w:type="spellStart"/>
+      <w:r>
+        <w:t>elit</w:t>
+      </w:r>
+      <w:proofErr w:type="spellEnd"/>
+      <w:r>
+        <w:t xml:space="preserve">. </w:t>
+      </w:r>
+      <w:proofErr w:type="spellStart"/>
+      <w:r>
+        <w:t>Quisque</w:t>
+      </w:r>
+      <w:proofErr w:type="spellEnd"/>
+      <w:r>
+        <w:t xml:space="preserve"> </w:t>
+      </w:r>
+      <w:proofErr w:type="spellStart"/>
+      <w:r>
+        <w:t>faucibus</w:t>
+      </w:r>
+      <w:proofErr w:type="spellEnd"/>
+      <w:r>
+        <w:t xml:space="preserve"> ex </w:t>
+      </w:r>
+      <w:proofErr w:type="spellStart"/>
+      <w:r>
+        <w:t>sapien</w:t>
+      </w:r>
+      <w:proofErr w:type="spellEnd"/>
+      <w:r>
+        <w:t xml:space="preserve"> vitae </w:t>
+      </w:r>
+      <w:proofErr w:type="spellStart"/>
+      <w:r>
+        <w:t>pellentesque</w:t>
+      </w:r>
+      <w:proofErr w:type="spellEnd"/>
+      <w:r>
+        <w:t xml:space="preserve"> </w:t>
+      </w:r>
+      <w:proofErr w:type="spellStart"/>
+      <w:r>
+        <w:t>sem</w:t>
+      </w:r>
+      <w:proofErr w:type="spellEnd"/>
+      <w:r>
+        <w:t xml:space="preserve"> </w:t>
+      </w:r>
+      <w:proofErr w:type="spellStart"/>
+      <w:r>
+        <w:t>placerat</w:t>
+      </w:r>
+      <w:proofErr w:type="spellEnd"/>
+      <w:r>
+        <w:t xml:space="preserve">. In id cursus mi </w:t>
+      </w:r>
+      <w:proofErr w:type="spellStart"/>
+      <w:r>
+        <w:t>pretium</w:t>
+      </w:r>
+      <w:proofErr w:type="spellEnd"/>
+      <w:r>
+        <w:t xml:space="preserve"> </w:t>
+      </w:r>
+      <w:proofErr w:type="spellStart"/>
+      <w:r>
+        <w:t>tellus</w:t>
+      </w:r>
+      <w:proofErr w:type="spellEnd"/>
+      <w:r>
+        <w:t xml:space="preserve"> </w:t>
+      </w:r>
+      <w:proofErr w:type="spellStart"/>
+      <w:r>
+        <w:t>duis</w:t>
+      </w:r>
+      <w:proofErr w:type="spellEnd"/>
+      <w:r>
+        <w:t xml:space="preserve"> convallis. Tempus </w:t>
+      </w:r>
+      <w:proofErr w:type="spellStart"/>
+      <w:r>
+        <w:t>leo</w:t>
+      </w:r>
+      <w:proofErr w:type="spellEnd"/>
+      <w:r>
+        <w:t xml:space="preserve"> </w:t>
+      </w:r>
+      <w:proofErr w:type="spellStart"/>
+      <w:r>
+        <w:t>eu</w:t>
+      </w:r>
+      <w:proofErr w:type="spellEnd"/>
+      <w:r>
+        <w:t xml:space="preserve"> </w:t>
+      </w:r>
+      <w:proofErr w:type="spellStart"/>
+      <w:r>
+        <w:t>aenean</w:t>
+      </w:r>
+      <w:proofErr w:type="spellEnd"/>
+      <w:r>
+        <w:t xml:space="preserve"> sed diam </w:t>
+      </w:r>
+      <w:proofErr w:type="spellStart"/>
+      <w:r>
+        <w:t>urna</w:t>
+      </w:r>
+      <w:proofErr w:type="spellEnd"/>
+      <w:r>
+        <w:t xml:space="preserve"> </w:t>
+      </w:r>
+      <w:proofErr w:type="spellStart"/>
+      <w:r>
+        <w:t>tempor</w:t>
+      </w:r>
+      <w:proofErr w:type="spellEnd"/>
+      <w:r>
+        <w:t xml:space="preserve">. Pulvinar </w:t>
+      </w:r>
+      <w:proofErr w:type="spellStart"/>
+      <w:r>
+        <w:t>vivamus</w:t>
+      </w:r>
+      <w:proofErr w:type="spellEnd"/>
+      <w:r>
+        <w:t xml:space="preserve"> </w:t>
+      </w:r>
+      <w:proofErr w:type="spellStart"/>
+      <w:r>
+        <w:t>fringilla</w:t>
+      </w:r>
+      <w:proofErr w:type="spellEnd"/>
+      <w:r>
+        <w:t xml:space="preserve"> </w:t>
+      </w:r>
+      <w:proofErr w:type="spellStart"/>
+      <w:r>
+        <w:t>lacus</w:t>
+      </w:r>
+      <w:proofErr w:type="spellEnd"/>
+      <w:r>
+        <w:t xml:space="preserve"> nec </w:t>
+      </w:r>
+      <w:proofErr w:type="spellStart"/>
+      <w:r>
+        <w:t>metus</w:t>
+      </w:r>
+      <w:proofErr w:type="spellEnd"/>
+      <w:r>
+        <w:t xml:space="preserve"> </w:t>
+      </w:r>
+      <w:proofErr w:type="spellStart"/>
+      <w:r>
+        <w:t>bibendum</w:t>
+      </w:r>
+      <w:proofErr w:type="spellEnd"/>
+      <w:r>
+        <w:t xml:space="preserve"> </w:t>
+      </w:r>
+      <w:proofErr w:type="spellStart"/>
+      <w:r>
+        <w:t>egestas</w:t>
+      </w:r>
+      <w:proofErr w:type="spellEnd"/>
+      <w:r>
+        <w:t xml:space="preserve">. Iaculis </w:t>
+      </w:r>
+      <w:proofErr w:type="spellStart"/>
+      <w:r>
+        <w:t>massa</w:t>
+      </w:r>
+      <w:proofErr w:type="spellEnd"/>
+      <w:r>
+        <w:t xml:space="preserve"> </w:t>
+      </w:r>
+      <w:proofErr w:type="spellStart"/>
+      <w:r>
+        <w:t>nisl</w:t>
+      </w:r>
+      <w:proofErr w:type="spellEnd"/>
+      <w:r>
+        <w:t xml:space="preserve"> </w:t>
+      </w:r>
+      <w:proofErr w:type="spellStart"/>
+      <w:r>
+        <w:t>malesuada</w:t>
+      </w:r>
+      <w:proofErr w:type="spellEnd"/>
+      <w:r>
+        <w:t xml:space="preserve"> lacinia integer nunc </w:t>
+      </w:r>
+      <w:proofErr w:type="spellStart"/>
+      <w:r>
+        <w:t>posuere</w:t>
+      </w:r>
+      <w:proofErr w:type="spellEnd"/>
+      <w:r>
+        <w:t xml:space="preserve">. Ut </w:t>
+      </w:r>
+      <w:proofErr w:type="spellStart"/>
+      <w:r>
+        <w:t>hendrerit</w:t>
+      </w:r>
+      <w:proofErr w:type="spellEnd"/>
+      <w:r>
+        <w:t xml:space="preserve"> semper vel class </w:t>
+      </w:r>
+      <w:proofErr w:type="spellStart"/>
+      <w:r>
+        <w:t>aptent</w:t>
+      </w:r>
+      <w:proofErr w:type="spellEnd"/>
+      <w:r>
+        <w:t xml:space="preserve"> </w:t>
+      </w:r>
+      <w:proofErr w:type="spellStart"/>
+      <w:r>
+        <w:t>taciti</w:t>
+      </w:r>
+      <w:proofErr w:type="spellEnd"/>
+      <w:r>
+        <w:t xml:space="preserve"> </w:t>
+      </w:r>
+      <w:proofErr w:type="spellStart"/>
+      <w:r>
+        <w:t>sociosqu</w:t>
+      </w:r>
+      <w:proofErr w:type="spellEnd"/>
+      <w:r>
+        <w:t xml:space="preserve">. Ad </w:t>
+      </w:r>
+      <w:proofErr w:type="spellStart"/>
+      <w:r>
+        <w:t>litora</w:t>
+      </w:r>
+      <w:proofErr w:type="spellEnd"/>
+      <w:r>
+        <w:t xml:space="preserve"> </w:t>
+      </w:r>
+      <w:proofErr w:type="spellStart"/>
+      <w:r>
+        <w:t>torquent</w:t>
+      </w:r>
+      <w:proofErr w:type="spellEnd"/>
+      <w:r>
+        <w:t xml:space="preserve"> per </w:t>
+      </w:r>
+      <w:proofErr w:type="spellStart"/>
+      <w:r>
+        <w:t>conubia</w:t>
+      </w:r>
+      <w:proofErr w:type="spellEnd"/>
+      <w:r>
+        <w:t xml:space="preserve"> nostra </w:t>
+      </w:r>
+      <w:proofErr w:type="spellStart"/>
+      <w:r>
+        <w:t>inceptos</w:t>
+      </w:r>
+      <w:proofErr w:type="spellEnd"/>
+      <w:r>
+        <w:t xml:space="preserve"> </w:t>
+      </w:r>
+      <w:proofErr w:type="spellStart"/>
+      <w:r>
+        <w:t>himenaeos</w:t>
+      </w:r>
+      <w:proofErr w:type="spellEnd"/>
+      <w:r>
+        <w:t>.</w:t>
+      </w:r>
+    </w:p>
+    <w:p/>
+    <w:p>
+      <w:r>
+        <w:t xml:space="preserve">Lorem ipsum dolor </w:t>
+      </w:r>
+      <w:proofErr w:type="gramStart"/>
+      <w:r>
+        <w:t>sit</w:t>
+      </w:r>
+      <w:proofErr w:type="gramEnd"/>
+      <w:r>
+        <w:t xml:space="preserve"> </w:t>
+      </w:r>
+      <w:proofErr w:type="spellStart"/>
+      <w:r>
+        <w:t>amet</w:t>
+      </w:r>
+      <w:proofErr w:type="spellEnd"/>
+      <w:r>
+        <w:t xml:space="preserve"> </w:t>
+      </w:r>
+      <w:proofErr w:type="spellStart"/>
+      <w:r>
+        <w:t>consectetur</w:t>
+      </w:r>
+      <w:proofErr w:type="spellEnd"/>
+      <w:r>
+        <w:t xml:space="preserve"> </w:t>
+      </w:r>
+      <w:proofErr w:type="spellStart"/>
+      <w:r>
+        <w:t>adipiscing</w:t>
+      </w:r>
+      <w:proofErr w:type="spellEnd"/>
+      <w:r>
+        <w:t xml:space="preserve"> </w:t>
+      </w:r>
+      <w:proofErr w:type="spellStart"/>
+      <w:r>
+        <w:t>elit</w:t>
+      </w:r>
+      <w:proofErr w:type="spellEnd"/>
+      <w:r>
+        <w:t xml:space="preserve">. </w:t>
+      </w:r>
+      <w:proofErr w:type="spellStart"/>
+      <w:r>
+        <w:t>Quisque</w:t>
+      </w:r>
+      <w:proofErr w:type="spellEnd"/>
+      <w:r>
+        <w:t xml:space="preserve"> </w:t>
+      </w:r>
+      <w:proofErr w:type="spellStart"/>
+      <w:r>
+        <w:t>faucibus</w:t>
+      </w:r>
+      <w:proofErr w:type="spellEnd"/>
+      <w:r>
+        <w:t xml:space="preserve"> ex </w:t>
+      </w:r>
+      <w:proofErr w:type="spellStart"/>
+      <w:r>
+        <w:t>sapien</w:t>
+      </w:r>
+      <w:proofErr w:type="spellEnd"/>
+      <w:r>
+        <w:t xml:space="preserve"> vitae </w:t>
+      </w:r>
+      <w:proofErr w:type="spellStart"/>
+      <w:r>
+        <w:t>pellentesque</w:t>
+      </w:r>
+      <w:proofErr w:type="spellEnd"/>
+      <w:r>
+        <w:t xml:space="preserve"> </w:t>
+      </w:r>
+      <w:proofErr w:type="spellStart"/>
+      <w:r>
+        <w:t>sem</w:t>
+      </w:r>
+      <w:proofErr w:type="spellEnd"/>
+      <w:r>
+        <w:t xml:space="preserve"> </w:t>
+      </w:r>
+      <w:proofErr w:type="spellStart"/>
+      <w:r>
+        <w:t>placerat</w:t>
+      </w:r>
+      <w:proofErr w:type="spellEnd"/>
+      <w:r>
+        <w:t xml:space="preserve">. In id cursus mi </w:t>
+      </w:r>
+      <w:proofErr w:type="spellStart"/>
+      <w:r>
+        <w:t>pretium</w:t>
+      </w:r>
+      <w:proofErr w:type="spellEnd"/>
+      <w:r>
+        <w:t xml:space="preserve"> </w:t>
+      </w:r>
+      <w:proofErr w:type="spellStart"/>
+      <w:r>
+        <w:t>tellus</w:t>
+      </w:r>
+      <w:proofErr w:type="spellEnd"/>
+      <w:r>
+        <w:t xml:space="preserve"> </w:t>
+      </w:r>
+      <w:proofErr w:type="spellStart"/>
+      <w:r>
+        <w:t>duis</w:t>
+      </w:r>
+      <w:proofErr w:type="spellEnd"/>
+      <w:r>
+        <w:t xml:space="preserve"> convallis. Tempus </w:t>
+      </w:r>
+      <w:proofErr w:type="spellStart"/>
+      <w:r>
+        <w:t>leo</w:t>
+      </w:r>
+      <w:proofErr w:type="spellEnd"/>
+      <w:r>
+        <w:t xml:space="preserve"> </w:t>
+      </w:r>
+      <w:proofErr w:type="spellStart"/>
+      <w:r>
+        <w:t>eu</w:t>
+      </w:r>
+      <w:proofErr w:type="spellEnd"/>
+      <w:r>
+        <w:t xml:space="preserve"> </w:t>
+      </w:r>
+      <w:proofErr w:type="spellStart"/>
+      <w:r>
+        <w:t>aenean</w:t>
+      </w:r>
+      <w:proofErr w:type="spellEnd"/>
+      <w:r>
+        <w:t xml:space="preserve"> sed diam </w:t>
+      </w:r>
+      <w:proofErr w:type="spellStart"/>
+      <w:r>
+        <w:t>urna</w:t>
+      </w:r>
+      <w:proofErr w:type="spellEnd"/>
+      <w:r>
+        <w:t xml:space="preserve"> </w:t>
+      </w:r>
+      <w:proofErr w:type="spellStart"/>
+      <w:r>
+        <w:t>tempor</w:t>
+      </w:r>
+      <w:proofErr w:type="spellEnd"/>
+      <w:r>
+        <w:t xml:space="preserve">. Pulvinar </w:t>
+      </w:r>
+      <w:proofErr w:type="spellStart"/>
+      <w:r>
+        <w:t>vivamus</w:t>
+      </w:r>
+      <w:proofErr w:type="spellEnd"/>
+      <w:r>
+        <w:t xml:space="preserve"> </w:t>
+      </w:r>
+      <w:proofErr w:type="spellStart"/>
+      <w:r>
+        <w:t>fringilla</w:t>
+      </w:r>
+      <w:proofErr w:type="spellEnd"/>
+      <w:r>
+        <w:t xml:space="preserve"> </w:t>
+      </w:r>
+      <w:proofErr w:type="spellStart"/>
+      <w:r>
+        <w:t>lacus</w:t>
+      </w:r>
+      <w:proofErr w:type="spellEnd"/>
+      <w:r>
+        <w:t xml:space="preserve"> nec </w:t>
+      </w:r>
+      <w:proofErr w:type="spellStart"/>
+      <w:r>
+        <w:t>metus</w:t>
+      </w:r>
+      <w:proofErr w:type="spellEnd"/>
+      <w:r>
+        <w:t xml:space="preserve"> </w:t>
+      </w:r>
+      <w:proofErr w:type="spellStart"/>
+      <w:r>
+        <w:t>bibendum</w:t>
+      </w:r>
+      <w:proofErr w:type="spellEnd"/>
+      <w:r>
+        <w:t xml:space="preserve"> </w:t>
+      </w:r>
+      <w:proofErr w:type="spellStart"/>
+      <w:r>
+        <w:t>egestas</w:t>
+      </w:r>
+      <w:proofErr w:type="spellEnd"/>
+      <w:r>
+        <w:t xml:space="preserve">. Iaculis </w:t>
+      </w:r>
+      <w:proofErr w:type="spellStart"/>
+      <w:r>
+        <w:t>massa</w:t>
+      </w:r>
+      <w:proofErr w:type="spellEnd"/>
+      <w:r>
+        <w:t xml:space="preserve"> </w:t>
+      </w:r>
+      <w:proofErr w:type="spellStart"/>
+      <w:r>
+        <w:t>nisl</w:t>
+      </w:r>
+      <w:proofErr w:type="spellEnd"/>
+      <w:r>
+        <w:t xml:space="preserve"> </w:t>
+      </w:r>
+      <w:proofErr w:type="spellStart"/>
+      <w:r>
+        <w:t>malesuada</w:t>
+      </w:r>
+      <w:proofErr w:type="spellEnd"/>
+      <w:r>
+        <w:t xml:space="preserve"> lacinia integer nunc </w:t>
+      </w:r>
+      <w:proofErr w:type="spellStart"/>
+      <w:r>
+        <w:t>posuere</w:t>
+      </w:r>
+      <w:proofErr w:type="spellEnd"/>
+      <w:r>
+        <w:t xml:space="preserve">. Ut </w:t>
+      </w:r>
+      <w:proofErr w:type="spellStart"/>
+      <w:r>
+        <w:t>hendrerit</w:t>
+      </w:r>
+      <w:proofErr w:type="spellEnd"/>
+      <w:r>
+        <w:t xml:space="preserve"> semper vel class </w:t>
+      </w:r>
+      <w:proofErr w:type="spellStart"/>
+      <w:r>
+        <w:t>aptent</w:t>
+      </w:r>
+      <w:proofErr w:type="spellEnd"/>
+      <w:r>
+        <w:t xml:space="preserve"> </w:t>
+      </w:r>
+      <w:proofErr w:type="spellStart"/>
+      <w:r>
+        <w:t>taciti</w:t>
+      </w:r>
+      <w:proofErr w:type="spellEnd"/>
+      <w:r>
+        <w:t xml:space="preserve"> </w:t>
+      </w:r>
+      <w:proofErr w:type="spellStart"/>
+      <w:r>
+        <w:t>sociosqu</w:t>
+      </w:r>
+      <w:proofErr w:type="spellEnd"/>
+      <w:r>
+        <w:t xml:space="preserve">. Ad </w:t>
+      </w:r>
+      <w:proofErr w:type="spellStart"/>
+      <w:r>
+        <w:t>litora</w:t>
+      </w:r>
+      <w:proofErr w:type="spellEnd"/>
+      <w:r>
+        <w:t xml:space="preserve"> </w:t>
+      </w:r>
+      <w:proofErr w:type="spellStart"/>
+      <w:r>
+        <w:t>torquent</w:t>
+      </w:r>
+      <w:proofErr w:type="spellEnd"/>
+      <w:r>
+        <w:t xml:space="preserve"> per </w:t>
+      </w:r>
+      <w:proofErr w:type="spellStart"/>
+      <w:r>
+        <w:t>conubia</w:t>
+      </w:r>
+      <w:proofErr w:type="spellEnd"/>
+      <w:r>
+        <w:t xml:space="preserve"> nostra </w:t>
+      </w:r>
+      <w:proofErr w:type="spellStart"/>
+      <w:r>
+        <w:t>inceptos</w:t>
+      </w:r>
+      <w:proofErr w:type="spellEnd"/>
+      <w:r>
+        <w:t xml:space="preserve"> </w:t>
+      </w:r>
+      <w:proofErr w:type="spellStart"/>
+      <w:r>
+        <w:t>himenaeos</w:t>
+      </w:r>
+      <w:proofErr w:type="spellEnd"/>
+      <w:r>
+        <w:t>.</w:t>
       </w:r>
     </w:p>
     <w:p>
@@ -722,7 +3777,311 @@
     </w:p>
     <w:p>
       <w:r>
-        <w:t>A reproducible mixed-methods workflow is feasible with accessible tools. Providing a transparent codebook, pre-registration of analysis plans, and concordance metrics supports credible integration. The included templates can be adapted to healthcare, education, and policy evaluation settings.</w:t>
+        <w:t xml:space="preserve">Lorem ipsum dolor </w:t>
+      </w:r>
+      <w:proofErr w:type="gramStart"/>
+      <w:r>
+        <w:t>sit</w:t>
+      </w:r>
+      <w:proofErr w:type="gramEnd"/>
+      <w:r>
+        <w:t xml:space="preserve"> </w:t>
+      </w:r>
+      <w:proofErr w:type="spellStart"/>
+      <w:r>
+        <w:t>amet</w:t>
+      </w:r>
+      <w:proofErr w:type="spellEnd"/>
+      <w:r>
+        <w:t xml:space="preserve"> </w:t>
+      </w:r>
+      <w:proofErr w:type="spellStart"/>
+      <w:r>
+        <w:t>consectetur</w:t>
+      </w:r>
+      <w:proofErr w:type="spellEnd"/>
+      <w:r>
+        <w:t xml:space="preserve"> </w:t>
+      </w:r>
+      <w:proofErr w:type="spellStart"/>
+      <w:r>
+        <w:t>adipiscing</w:t>
+      </w:r>
+      <w:proofErr w:type="spellEnd"/>
+      <w:r>
+        <w:t xml:space="preserve"> </w:t>
+      </w:r>
+      <w:proofErr w:type="spellStart"/>
+      <w:r>
+        <w:t>elit</w:t>
+      </w:r>
+      <w:proofErr w:type="spellEnd"/>
+      <w:r>
+        <w:t xml:space="preserve">. </w:t>
+      </w:r>
+      <w:proofErr w:type="spellStart"/>
+      <w:r>
+        <w:t>Quisque</w:t>
+      </w:r>
+      <w:proofErr w:type="spellEnd"/>
+      <w:r>
+        <w:t xml:space="preserve"> </w:t>
+      </w:r>
+      <w:proofErr w:type="spellStart"/>
+      <w:r>
+        <w:t>faucibus</w:t>
+      </w:r>
+      <w:proofErr w:type="spellEnd"/>
+      <w:r>
+        <w:t xml:space="preserve"> ex </w:t>
+      </w:r>
+      <w:proofErr w:type="spellStart"/>
+      <w:r>
+        <w:t>sapien</w:t>
+      </w:r>
+      <w:proofErr w:type="spellEnd"/>
+      <w:r>
+        <w:t xml:space="preserve"> vitae </w:t>
+      </w:r>
+      <w:proofErr w:type="spellStart"/>
+      <w:r>
+        <w:t>pellentesque</w:t>
+      </w:r>
+      <w:proofErr w:type="spellEnd"/>
+      <w:r>
+        <w:t xml:space="preserve"> </w:t>
+      </w:r>
+      <w:proofErr w:type="spellStart"/>
+      <w:r>
+        <w:t>sem</w:t>
+      </w:r>
+      <w:proofErr w:type="spellEnd"/>
+      <w:r>
+        <w:t xml:space="preserve"> </w:t>
+      </w:r>
+      <w:proofErr w:type="spellStart"/>
+      <w:r>
+        <w:t>placerat</w:t>
+      </w:r>
+      <w:proofErr w:type="spellEnd"/>
+      <w:r>
+        <w:t xml:space="preserve">. In id cursus mi </w:t>
+      </w:r>
+      <w:proofErr w:type="spellStart"/>
+      <w:r>
+        <w:t>pretium</w:t>
+      </w:r>
+      <w:proofErr w:type="spellEnd"/>
+      <w:r>
+        <w:t xml:space="preserve"> </w:t>
+      </w:r>
+      <w:proofErr w:type="spellStart"/>
+      <w:r>
+        <w:t>tellus</w:t>
+      </w:r>
+      <w:proofErr w:type="spellEnd"/>
+      <w:r>
+        <w:t xml:space="preserve"> </w:t>
+      </w:r>
+      <w:proofErr w:type="spellStart"/>
+      <w:r>
+        <w:t>duis</w:t>
+      </w:r>
+      <w:proofErr w:type="spellEnd"/>
+      <w:r>
+        <w:t xml:space="preserve"> convallis. Tempus </w:t>
+      </w:r>
+      <w:proofErr w:type="spellStart"/>
+      <w:r>
+        <w:t>leo</w:t>
+      </w:r>
+      <w:proofErr w:type="spellEnd"/>
+      <w:r>
+        <w:t xml:space="preserve"> </w:t>
+      </w:r>
+      <w:proofErr w:type="spellStart"/>
+      <w:r>
+        <w:t>eu</w:t>
+      </w:r>
+      <w:proofErr w:type="spellEnd"/>
+      <w:r>
+        <w:t xml:space="preserve"> </w:t>
+      </w:r>
+      <w:proofErr w:type="spellStart"/>
+      <w:r>
+        <w:t>aenean</w:t>
+      </w:r>
+      <w:proofErr w:type="spellEnd"/>
+      <w:r>
+        <w:t xml:space="preserve"> sed diam </w:t>
+      </w:r>
+      <w:proofErr w:type="spellStart"/>
+      <w:r>
+        <w:t>urna</w:t>
+      </w:r>
+      <w:proofErr w:type="spellEnd"/>
+      <w:r>
+        <w:t xml:space="preserve"> </w:t>
+      </w:r>
+      <w:proofErr w:type="spellStart"/>
+      <w:r>
+        <w:t>tempor</w:t>
+      </w:r>
+      <w:proofErr w:type="spellEnd"/>
+      <w:r>
+        <w:t xml:space="preserve">. Pulvinar </w:t>
+      </w:r>
+      <w:proofErr w:type="spellStart"/>
+      <w:r>
+        <w:t>vivamus</w:t>
+      </w:r>
+      <w:proofErr w:type="spellEnd"/>
+      <w:r>
+        <w:t xml:space="preserve"> </w:t>
+      </w:r>
+      <w:proofErr w:type="spellStart"/>
+      <w:r>
+        <w:t>fringilla</w:t>
+      </w:r>
+      <w:proofErr w:type="spellEnd"/>
+      <w:r>
+        <w:t xml:space="preserve"> </w:t>
+      </w:r>
+      <w:proofErr w:type="spellStart"/>
+      <w:r>
+        <w:t>lacus</w:t>
+      </w:r>
+      <w:proofErr w:type="spellEnd"/>
+      <w:r>
+        <w:t xml:space="preserve"> nec </w:t>
+      </w:r>
+      <w:proofErr w:type="spellStart"/>
+      <w:r>
+        <w:t>metus</w:t>
+      </w:r>
+      <w:proofErr w:type="spellEnd"/>
+      <w:r>
+        <w:t xml:space="preserve"> </w:t>
+      </w:r>
+      <w:proofErr w:type="spellStart"/>
+      <w:r>
+        <w:t>bibendum</w:t>
+      </w:r>
+      <w:proofErr w:type="spellEnd"/>
+      <w:r>
+        <w:t xml:space="preserve"> </w:t>
+      </w:r>
+      <w:proofErr w:type="spellStart"/>
+      <w:r>
+        <w:t>egestas</w:t>
+      </w:r>
+      <w:proofErr w:type="spellEnd"/>
+      <w:r>
+        <w:t xml:space="preserve">. Iaculis </w:t>
+      </w:r>
+      <w:proofErr w:type="spellStart"/>
+      <w:r>
+        <w:t>massa</w:t>
+      </w:r>
+      <w:proofErr w:type="spellEnd"/>
+      <w:r>
+        <w:t xml:space="preserve"> </w:t>
+      </w:r>
+      <w:proofErr w:type="spellStart"/>
+      <w:r>
+        <w:t>nisl</w:t>
+      </w:r>
+      <w:proofErr w:type="spellEnd"/>
+      <w:r>
+        <w:t xml:space="preserve"> </w:t>
+      </w:r>
+      <w:proofErr w:type="spellStart"/>
+      <w:r>
+        <w:t>malesuada</w:t>
+      </w:r>
+      <w:proofErr w:type="spellEnd"/>
+      <w:r>
+        <w:t xml:space="preserve"> lacinia integer nunc </w:t>
+      </w:r>
+      <w:proofErr w:type="spellStart"/>
+      <w:r>
+        <w:t>posuere</w:t>
+      </w:r>
+      <w:proofErr w:type="spellEnd"/>
+      <w:r>
+        <w:t xml:space="preserve">. Ut </w:t>
+      </w:r>
+      <w:proofErr w:type="spellStart"/>
+      <w:r>
+        <w:t>hendrerit</w:t>
+      </w:r>
+      <w:proofErr w:type="spellEnd"/>
+      <w:r>
+        <w:t xml:space="preserve"> semper vel class </w:t>
+      </w:r>
+      <w:proofErr w:type="spellStart"/>
+      <w:r>
+        <w:t>aptent</w:t>
+      </w:r>
+      <w:proofErr w:type="spellEnd"/>
+      <w:r>
+        <w:t xml:space="preserve"> </w:t>
+      </w:r>
+      <w:proofErr w:type="spellStart"/>
+      <w:r>
+        <w:t>taciti</w:t>
+      </w:r>
+      <w:proofErr w:type="spellEnd"/>
+      <w:r>
+        <w:t xml:space="preserve"> </w:t>
+      </w:r>
+      <w:proofErr w:type="spellStart"/>
+      <w:r>
+        <w:t>sociosqu</w:t>
+      </w:r>
+      <w:proofErr w:type="spellEnd"/>
+      <w:r>
+        <w:t xml:space="preserve">. Ad </w:t>
+      </w:r>
+      <w:proofErr w:type="spellStart"/>
+      <w:r>
+        <w:t>litora</w:t>
+      </w:r>
+      <w:proofErr w:type="spellEnd"/>
+      <w:r>
+        <w:t xml:space="preserve"> </w:t>
+      </w:r>
+      <w:proofErr w:type="spellStart"/>
+      <w:r>
+        <w:t>torquent</w:t>
+      </w:r>
+      <w:proofErr w:type="spellEnd"/>
+      <w:r>
+        <w:t xml:space="preserve"> per </w:t>
+      </w:r>
+      <w:proofErr w:type="spellStart"/>
+      <w:r>
+        <w:t>conubia</w:t>
+      </w:r>
+      <w:proofErr w:type="spellEnd"/>
+      <w:r>
+        <w:t xml:space="preserve"> nostra </w:t>
+      </w:r>
+      <w:proofErr w:type="spellStart"/>
+      <w:r>
+        <w:t>inceptos</w:t>
+      </w:r>
+      <w:proofErr w:type="spellEnd"/>
+      <w:r>
+        <w:t xml:space="preserve"> </w:t>
+      </w:r>
+      <w:proofErr w:type="spellStart"/>
+      <w:r>
+        <w:t>himenaeos</w:t>
+      </w:r>
+      <w:proofErr w:type="spellEnd"/>
+      <w:r>
+        <w:t>.</w:t>
       </w:r>
     </w:p>
     <w:p>
@@ -763,7 +4122,311 @@
     </w:p>
     <w:p>
       <w:r>
-        <w:t>We thank collaborators for feedback on early drafts and acknowledge support from institutional research funds. Any errors remain our own.</w:t>
+        <w:t xml:space="preserve">Lorem ipsum dolor </w:t>
+      </w:r>
+      <w:proofErr w:type="gramStart"/>
+      <w:r>
+        <w:t>sit</w:t>
+      </w:r>
+      <w:proofErr w:type="gramEnd"/>
+      <w:r>
+        <w:t xml:space="preserve"> </w:t>
+      </w:r>
+      <w:proofErr w:type="spellStart"/>
+      <w:r>
+        <w:t>amet</w:t>
+      </w:r>
+      <w:proofErr w:type="spellEnd"/>
+      <w:r>
+        <w:t xml:space="preserve"> </w:t>
+      </w:r>
+      <w:proofErr w:type="spellStart"/>
+      <w:r>
+        <w:t>consectetur</w:t>
+      </w:r>
+      <w:proofErr w:type="spellEnd"/>
+      <w:r>
+        <w:t xml:space="preserve"> </w:t>
+      </w:r>
+      <w:proofErr w:type="spellStart"/>
+      <w:r>
+        <w:t>adipiscing</w:t>
+      </w:r>
+      <w:proofErr w:type="spellEnd"/>
+      <w:r>
+        <w:t xml:space="preserve"> </w:t>
+      </w:r>
+      <w:proofErr w:type="spellStart"/>
+      <w:r>
+        <w:t>elit</w:t>
+      </w:r>
+      <w:proofErr w:type="spellEnd"/>
+      <w:r>
+        <w:t xml:space="preserve">. </w:t>
+      </w:r>
+      <w:proofErr w:type="spellStart"/>
+      <w:r>
+        <w:t>Quisque</w:t>
+      </w:r>
+      <w:proofErr w:type="spellEnd"/>
+      <w:r>
+        <w:t xml:space="preserve"> </w:t>
+      </w:r>
+      <w:proofErr w:type="spellStart"/>
+      <w:r>
+        <w:t>faucibus</w:t>
+      </w:r>
+      <w:proofErr w:type="spellEnd"/>
+      <w:r>
+        <w:t xml:space="preserve"> ex </w:t>
+      </w:r>
+      <w:proofErr w:type="spellStart"/>
+      <w:r>
+        <w:t>sapien</w:t>
+      </w:r>
+      <w:proofErr w:type="spellEnd"/>
+      <w:r>
+        <w:t xml:space="preserve"> vitae </w:t>
+      </w:r>
+      <w:proofErr w:type="spellStart"/>
+      <w:r>
+        <w:t>pellentesque</w:t>
+      </w:r>
+      <w:proofErr w:type="spellEnd"/>
+      <w:r>
+        <w:t xml:space="preserve"> </w:t>
+      </w:r>
+      <w:proofErr w:type="spellStart"/>
+      <w:r>
+        <w:t>sem</w:t>
+      </w:r>
+      <w:proofErr w:type="spellEnd"/>
+      <w:r>
+        <w:t xml:space="preserve"> </w:t>
+      </w:r>
+      <w:proofErr w:type="spellStart"/>
+      <w:r>
+        <w:t>placerat</w:t>
+      </w:r>
+      <w:proofErr w:type="spellEnd"/>
+      <w:r>
+        <w:t xml:space="preserve">. In id cursus mi </w:t>
+      </w:r>
+      <w:proofErr w:type="spellStart"/>
+      <w:r>
+        <w:t>pretium</w:t>
+      </w:r>
+      <w:proofErr w:type="spellEnd"/>
+      <w:r>
+        <w:t xml:space="preserve"> </w:t>
+      </w:r>
+      <w:proofErr w:type="spellStart"/>
+      <w:r>
+        <w:t>tellus</w:t>
+      </w:r>
+      <w:proofErr w:type="spellEnd"/>
+      <w:r>
+        <w:t xml:space="preserve"> </w:t>
+      </w:r>
+      <w:proofErr w:type="spellStart"/>
+      <w:r>
+        <w:t>duis</w:t>
+      </w:r>
+      <w:proofErr w:type="spellEnd"/>
+      <w:r>
+        <w:t xml:space="preserve"> convallis. Tempus </w:t>
+      </w:r>
+      <w:proofErr w:type="spellStart"/>
+      <w:r>
+        <w:t>leo</w:t>
+      </w:r>
+      <w:proofErr w:type="spellEnd"/>
+      <w:r>
+        <w:t xml:space="preserve"> </w:t>
+      </w:r>
+      <w:proofErr w:type="spellStart"/>
+      <w:r>
+        <w:t>eu</w:t>
+      </w:r>
+      <w:proofErr w:type="spellEnd"/>
+      <w:r>
+        <w:t xml:space="preserve"> </w:t>
+      </w:r>
+      <w:proofErr w:type="spellStart"/>
+      <w:r>
+        <w:t>aenean</w:t>
+      </w:r>
+      <w:proofErr w:type="spellEnd"/>
+      <w:r>
+        <w:t xml:space="preserve"> sed diam </w:t>
+      </w:r>
+      <w:proofErr w:type="spellStart"/>
+      <w:r>
+        <w:t>urna</w:t>
+      </w:r>
+      <w:proofErr w:type="spellEnd"/>
+      <w:r>
+        <w:t xml:space="preserve"> </w:t>
+      </w:r>
+      <w:proofErr w:type="spellStart"/>
+      <w:r>
+        <w:t>tempor</w:t>
+      </w:r>
+      <w:proofErr w:type="spellEnd"/>
+      <w:r>
+        <w:t xml:space="preserve">. Pulvinar </w:t>
+      </w:r>
+      <w:proofErr w:type="spellStart"/>
+      <w:r>
+        <w:t>vivamus</w:t>
+      </w:r>
+      <w:proofErr w:type="spellEnd"/>
+      <w:r>
+        <w:t xml:space="preserve"> </w:t>
+      </w:r>
+      <w:proofErr w:type="spellStart"/>
+      <w:r>
+        <w:t>fringilla</w:t>
+      </w:r>
+      <w:proofErr w:type="spellEnd"/>
+      <w:r>
+        <w:t xml:space="preserve"> </w:t>
+      </w:r>
+      <w:proofErr w:type="spellStart"/>
+      <w:r>
+        <w:t>lacus</w:t>
+      </w:r>
+      <w:proofErr w:type="spellEnd"/>
+      <w:r>
+        <w:t xml:space="preserve"> nec </w:t>
+      </w:r>
+      <w:proofErr w:type="spellStart"/>
+      <w:r>
+        <w:t>metus</w:t>
+      </w:r>
+      <w:proofErr w:type="spellEnd"/>
+      <w:r>
+        <w:t xml:space="preserve"> </w:t>
+      </w:r>
+      <w:proofErr w:type="spellStart"/>
+      <w:r>
+        <w:t>bibendum</w:t>
+      </w:r>
+      <w:proofErr w:type="spellEnd"/>
+      <w:r>
+        <w:t xml:space="preserve"> </w:t>
+      </w:r>
+      <w:proofErr w:type="spellStart"/>
+      <w:r>
+        <w:t>egestas</w:t>
+      </w:r>
+      <w:proofErr w:type="spellEnd"/>
+      <w:r>
+        <w:t xml:space="preserve">. Iaculis </w:t>
+      </w:r>
+      <w:proofErr w:type="spellStart"/>
+      <w:r>
+        <w:t>massa</w:t>
+      </w:r>
+      <w:proofErr w:type="spellEnd"/>
+      <w:r>
+        <w:t xml:space="preserve"> </w:t>
+      </w:r>
+      <w:proofErr w:type="spellStart"/>
+      <w:r>
+        <w:t>nisl</w:t>
+      </w:r>
+      <w:proofErr w:type="spellEnd"/>
+      <w:r>
+        <w:t xml:space="preserve"> </w:t>
+      </w:r>
+      <w:proofErr w:type="spellStart"/>
+      <w:r>
+        <w:t>malesuada</w:t>
+      </w:r>
+      <w:proofErr w:type="spellEnd"/>
+      <w:r>
+        <w:t xml:space="preserve"> lacinia integer nunc </w:t>
+      </w:r>
+      <w:proofErr w:type="spellStart"/>
+      <w:r>
+        <w:t>posuere</w:t>
+      </w:r>
+      <w:proofErr w:type="spellEnd"/>
+      <w:r>
+        <w:t xml:space="preserve">. Ut </w:t>
+      </w:r>
+      <w:proofErr w:type="spellStart"/>
+      <w:r>
+        <w:t>hendrerit</w:t>
+      </w:r>
+      <w:proofErr w:type="spellEnd"/>
+      <w:r>
+        <w:t xml:space="preserve"> semper vel class </w:t>
+      </w:r>
+      <w:proofErr w:type="spellStart"/>
+      <w:r>
+        <w:t>aptent</w:t>
+      </w:r>
+      <w:proofErr w:type="spellEnd"/>
+      <w:r>
+        <w:t xml:space="preserve"> </w:t>
+      </w:r>
+      <w:proofErr w:type="spellStart"/>
+      <w:r>
+        <w:t>taciti</w:t>
+      </w:r>
+      <w:proofErr w:type="spellEnd"/>
+      <w:r>
+        <w:t xml:space="preserve"> </w:t>
+      </w:r>
+      <w:proofErr w:type="spellStart"/>
+      <w:r>
+        <w:t>sociosqu</w:t>
+      </w:r>
+      <w:proofErr w:type="spellEnd"/>
+      <w:r>
+        <w:t xml:space="preserve">. Ad </w:t>
+      </w:r>
+      <w:proofErr w:type="spellStart"/>
+      <w:r>
+        <w:t>litora</w:t>
+      </w:r>
+      <w:proofErr w:type="spellEnd"/>
+      <w:r>
+        <w:t xml:space="preserve"> </w:t>
+      </w:r>
+      <w:proofErr w:type="spellStart"/>
+      <w:r>
+        <w:t>torquent</w:t>
+      </w:r>
+      <w:proofErr w:type="spellEnd"/>
+      <w:r>
+        <w:t xml:space="preserve"> per </w:t>
+      </w:r>
+      <w:proofErr w:type="spellStart"/>
+      <w:r>
+        <w:t>conubia</w:t>
+      </w:r>
+      <w:proofErr w:type="spellEnd"/>
+      <w:r>
+        <w:t xml:space="preserve"> nostra </w:t>
+      </w:r>
+      <w:proofErr w:type="spellStart"/>
+      <w:r>
+        <w:t>inceptos</w:t>
+      </w:r>
+      <w:proofErr w:type="spellEnd"/>
+      <w:r>
+        <w:t xml:space="preserve"> </w:t>
+      </w:r>
+      <w:proofErr w:type="spellStart"/>
+      <w:r>
+        <w:t>himenaeos</w:t>
+      </w:r>
+      <w:proofErr w:type="spellEnd"/>
+      <w:r>
+        <w:t>.</w:t>
       </w:r>
     </w:p>
     <w:p>
@@ -781,7 +4444,6 @@
     </w:p>
     <w:p>
       <w:r>
-        <w:lastRenderedPageBreak/>
         <w:t>&lt;</w:t>
       </w:r>
       <w:proofErr w:type="spellStart"/>
@@ -804,24 +4466,6 @@
     <w:p>
       <w:r>
         <w:t>[1] Creswell JW, Plano Clark VL. Designing and Conducting Mixed Methods Research. 3rd ed. Sage; 2018.</w:t>
-      </w:r>
-    </w:p>
-    <w:p>
-      <w:r>
-        <w:t>[2] Braun V, Clarke V. Thematic analysis: A practical guide. Sage; 2021.</w:t>
-      </w:r>
-    </w:p>
-    <w:p>
-      <w:r>
-        <w:t xml:space="preserve">[3] Blei DM, Ng AY, Jordan MI. Latent Dirichlet Allocation. Journal of Machine Learning Research. </w:t>
-      </w:r>
-      <w:proofErr w:type="gramStart"/>
-      <w:r>
-        <w:t>2003;3:993</w:t>
-      </w:r>
-      <w:proofErr w:type="gramEnd"/>
-      <w:r>
-        <w:t>–1022.</w:t>
       </w:r>
     </w:p>
     <w:p>
@@ -1289,7 +4933,6 @@
     <w:next w:val="Normal"/>
     <w:link w:val="Heading2Char"/>
     <w:uiPriority w:val="9"/>
-    <w:semiHidden/>
     <w:unhideWhenUsed/>
     <w:qFormat/>
     <w:rsid w:val="00650093"/>
@@ -1314,7 +4957,6 @@
     <w:next w:val="Normal"/>
     <w:link w:val="Heading3Char"/>
     <w:uiPriority w:val="9"/>
-    <w:semiHidden/>
     <w:unhideWhenUsed/>
     <w:qFormat/>
     <w:rsid w:val="00650093"/>
@@ -1534,7 +5176,6 @@
     <w:basedOn w:val="DefaultParagraphFont"/>
     <w:link w:val="Heading2"/>
     <w:uiPriority w:val="9"/>
-    <w:semiHidden/>
     <w:rsid w:val="00650093"/>
     <w:rPr>
       <w:rFonts w:asciiTheme="majorHAnsi" w:eastAsiaTheme="majorEastAsia" w:hAnsiTheme="majorHAnsi" w:cstheme="majorBidi"/>
@@ -1548,7 +5189,6 @@
     <w:basedOn w:val="DefaultParagraphFont"/>
     <w:link w:val="Heading3"/>
     <w:uiPriority w:val="9"/>
-    <w:semiHidden/>
     <w:rsid w:val="00650093"/>
     <w:rPr>
       <w:rFonts w:eastAsiaTheme="majorEastAsia" w:cstheme="majorBidi"/>

</xml_diff>

<commit_message>
chore: update paperaj.docx file with new content
</commit_message>
<xml_diff>
--- a/test/paperaj.docx
+++ b/test/paperaj.docx
@@ -324,7 +324,15 @@
       </w:r>
       <w:proofErr w:type="spellEnd"/>
       <w:r>
-        <w:t xml:space="preserve">. Iaculis </w:t>
+        <w:t xml:space="preserve">. </w:t>
+      </w:r>
+      <w:proofErr w:type="spellStart"/>
+      <w:r>
+        <w:t>Iaculis</w:t>
+      </w:r>
+      <w:proofErr w:type="spellEnd"/>
+      <w:r>
+        <w:t xml:space="preserve"> </w:t>
       </w:r>
       <w:proofErr w:type="spellStart"/>
       <w:r>
@@ -728,7 +736,15 @@
       </w:r>
       <w:proofErr w:type="spellEnd"/>
       <w:r>
-        <w:t xml:space="preserve">. Iaculis </w:t>
+        <w:t xml:space="preserve">. </w:t>
+      </w:r>
+      <w:proofErr w:type="spellStart"/>
+      <w:r>
+        <w:t>Iaculis</w:t>
+      </w:r>
+      <w:proofErr w:type="spellEnd"/>
+      <w:r>
+        <w:t xml:space="preserve"> </w:t>
       </w:r>
       <w:proofErr w:type="spellStart"/>
       <w:r>
@@ -1038,7 +1054,15 @@
       </w:r>
       <w:proofErr w:type="spellEnd"/>
       <w:r>
-        <w:t xml:space="preserve">. Iaculis </w:t>
+        <w:t xml:space="preserve">. </w:t>
+      </w:r>
+      <w:proofErr w:type="spellStart"/>
+      <w:r>
+        <w:t>Iaculis</w:t>
+      </w:r>
+      <w:proofErr w:type="spellEnd"/>
+      <w:r>
+        <w:t xml:space="preserve"> </w:t>
       </w:r>
       <w:proofErr w:type="spellStart"/>
       <w:r>
@@ -1395,7 +1419,15 @@
       </w:r>
       <w:proofErr w:type="spellEnd"/>
       <w:r>
-        <w:t xml:space="preserve">. Iaculis </w:t>
+        <w:t xml:space="preserve">. </w:t>
+      </w:r>
+      <w:proofErr w:type="spellStart"/>
+      <w:r>
+        <w:t>Iaculis</w:t>
+      </w:r>
+      <w:proofErr w:type="spellEnd"/>
+      <w:r>
+        <w:t xml:space="preserve"> </w:t>
       </w:r>
       <w:proofErr w:type="spellStart"/>
       <w:r>
@@ -1715,7 +1747,15 @@
       </w:r>
       <w:proofErr w:type="spellEnd"/>
       <w:r>
-        <w:t xml:space="preserve">. Iaculis </w:t>
+        <w:t xml:space="preserve">. </w:t>
+      </w:r>
+      <w:proofErr w:type="spellStart"/>
+      <w:r>
+        <w:t>Iaculis</w:t>
+      </w:r>
+      <w:proofErr w:type="spellEnd"/>
+      <w:r>
+        <w:t xml:space="preserve"> </w:t>
       </w:r>
       <w:proofErr w:type="spellStart"/>
       <w:r>
@@ -2035,7 +2075,15 @@
       </w:r>
       <w:proofErr w:type="spellEnd"/>
       <w:r>
-        <w:t xml:space="preserve">. Iaculis </w:t>
+        <w:t xml:space="preserve">. </w:t>
+      </w:r>
+      <w:proofErr w:type="spellStart"/>
+      <w:r>
+        <w:t>Iaculis</w:t>
+      </w:r>
+      <w:proofErr w:type="spellEnd"/>
+      <w:r>
+        <w:t xml:space="preserve"> </w:t>
       </w:r>
       <w:proofErr w:type="spellStart"/>
       <w:r>
@@ -2208,6 +2256,20 @@
       <w:r>
         <w:t>: CRISP-T python package</w:t>
       </w:r>
+      <w:r>
+        <w:t xml:space="preserve"> logo (From: </w:t>
+      </w:r>
+      <w:hyperlink r:id="rId5" w:history="1">
+        <w:r>
+          <w:rPr>
+            <w:rStyle w:val="Hyperlink"/>
+          </w:rPr>
+          <w:t>https://github.com/dermatologist/crisp-t</w:t>
+        </w:r>
+      </w:hyperlink>
+      <w:r>
+        <w:t xml:space="preserve"> )</w:t>
+      </w:r>
     </w:p>
     <w:p>
       <w:r>
@@ -2445,7 +2507,15 @@
       </w:r>
       <w:proofErr w:type="spellEnd"/>
       <w:r>
-        <w:t xml:space="preserve">. Iaculis </w:t>
+        <w:t xml:space="preserve">. </w:t>
+      </w:r>
+      <w:proofErr w:type="spellStart"/>
+      <w:r>
+        <w:t>Iaculis</w:t>
+      </w:r>
+      <w:proofErr w:type="spellEnd"/>
+      <w:r>
+        <w:t xml:space="preserve"> </w:t>
       </w:r>
       <w:proofErr w:type="spellStart"/>
       <w:r>
@@ -2755,7 +2825,15 @@
       </w:r>
       <w:proofErr w:type="spellEnd"/>
       <w:r>
-        <w:t xml:space="preserve">. Iaculis </w:t>
+        <w:t xml:space="preserve">. </w:t>
+      </w:r>
+      <w:proofErr w:type="spellStart"/>
+      <w:r>
+        <w:t>Iaculis</w:t>
+      </w:r>
+      <w:proofErr w:type="spellEnd"/>
+      <w:r>
+        <w:t xml:space="preserve"> </w:t>
       </w:r>
       <w:proofErr w:type="spellStart"/>
       <w:r>
@@ -3324,7 +3402,15 @@
       </w:r>
       <w:proofErr w:type="spellEnd"/>
       <w:r>
-        <w:t xml:space="preserve">. Iaculis </w:t>
+        <w:t xml:space="preserve">. </w:t>
+      </w:r>
+      <w:proofErr w:type="spellStart"/>
+      <w:r>
+        <w:t>Iaculis</w:t>
+      </w:r>
+      <w:proofErr w:type="spellEnd"/>
+      <w:r>
+        <w:t xml:space="preserve"> </w:t>
       </w:r>
       <w:proofErr w:type="spellStart"/>
       <w:r>
@@ -3634,7 +3720,15 @@
       </w:r>
       <w:proofErr w:type="spellEnd"/>
       <w:r>
-        <w:t xml:space="preserve">. Iaculis </w:t>
+        <w:t xml:space="preserve">. </w:t>
+      </w:r>
+      <w:proofErr w:type="spellStart"/>
+      <w:r>
+        <w:t>Iaculis</w:t>
+      </w:r>
+      <w:proofErr w:type="spellEnd"/>
+      <w:r>
+        <w:t xml:space="preserve"> </w:t>
       </w:r>
       <w:proofErr w:type="spellStart"/>
       <w:r>
@@ -3977,7 +4071,15 @@
       </w:r>
       <w:proofErr w:type="spellEnd"/>
       <w:r>
-        <w:t xml:space="preserve">. Iaculis </w:t>
+        <w:t xml:space="preserve">. </w:t>
+      </w:r>
+      <w:proofErr w:type="spellStart"/>
+      <w:r>
+        <w:t>Iaculis</w:t>
+      </w:r>
+      <w:proofErr w:type="spellEnd"/>
+      <w:r>
+        <w:t xml:space="preserve"> </w:t>
       </w:r>
       <w:proofErr w:type="spellStart"/>
       <w:r>
@@ -4322,7 +4424,15 @@
       </w:r>
       <w:proofErr w:type="spellEnd"/>
       <w:r>
-        <w:t xml:space="preserve">. Iaculis </w:t>
+        <w:t xml:space="preserve">. </w:t>
+      </w:r>
+      <w:proofErr w:type="spellStart"/>
+      <w:r>
+        <w:t>Iaculis</w:t>
+      </w:r>
+      <w:proofErr w:type="spellEnd"/>
+      <w:r>
+        <w:t xml:space="preserve"> </w:t>
       </w:r>
       <w:proofErr w:type="spellStart"/>
       <w:r>
@@ -5134,7 +5244,6 @@
   <w:style w:type="character" w:default="1" w:styleId="DefaultParagraphFont">
     <w:name w:val="Default Paragraph Font"/>
     <w:uiPriority w:val="1"/>
-    <w:semiHidden/>
     <w:unhideWhenUsed/>
   </w:style>
   <w:style w:type="table" w:default="1" w:styleId="TableNormal">

</xml_diff>